<commit_message>
Modificação do diretório de scritps sql e atualização de tutoriais
</commit_message>
<xml_diff>
--- a/docs/tutorial_testes/Configuração do VSCODE.docx
+++ b/docs/tutorial_testes/Configuração do VSCODE.docx
@@ -4,7 +4,7 @@
   <w:body>
     <w:p>
       <w:pPr>
-        <w:pStyle w:val="857"/>
+        <w:pStyle w:val="859"/>
         <w:pBdr>
           <w:top w:val="none" w:color="000000" w:sz="4" w:space="0"/>
           <w:left w:val="none" w:color="000000" w:sz="4" w:space="0"/>
@@ -191,7 +191,7 @@
     </w:p>
     <w:p>
       <w:pPr>
-        <w:pStyle w:val="857"/>
+        <w:pStyle w:val="859"/>
         <w:pBdr>
           <w:top w:val="none" w:color="000000" w:sz="4" w:space="0"/>
           <w:left w:val="none" w:color="000000" w:sz="4" w:space="0"/>
@@ -246,7 +246,7 @@
     </w:p>
     <w:p>
       <w:pPr>
-        <w:pStyle w:val="918"/>
+        <w:pStyle w:val="920"/>
         <w:numPr>
           <w:ilvl w:val="0"/>
           <w:numId w:val="14"/>
@@ -282,7 +282,7 @@
     </w:p>
     <w:p>
       <w:pPr>
-        <w:pStyle w:val="918"/>
+        <w:pStyle w:val="920"/>
         <w:numPr>
           <w:ilvl w:val="0"/>
           <w:numId w:val="14"/>
@@ -402,7 +402,7 @@
     </w:p>
     <w:p>
       <w:pPr>
-        <w:pStyle w:val="857"/>
+        <w:pStyle w:val="859"/>
         <w:pBdr>
           <w:top w:val="none" w:color="000000" w:sz="4" w:space="0"/>
           <w:left w:val="none" w:color="000000" w:sz="4" w:space="0"/>
@@ -457,7 +457,7 @@
     </w:p>
     <w:tbl>
       <w:tblPr>
-        <w:tblStyle w:val="729"/>
+        <w:tblStyle w:val="731"/>
         <w:tblInd w:w="0" w:type="dxa"/>
         <w:tblW w:w="0" w:type="auto"/>
         <w:tblBorders>
@@ -771,46 +771,48 @@
               <w:spacing w:after="0" w:before="0" w:line="240" w:lineRule="auto"/>
               <w:ind/>
               <w:rPr>
-                <w:rFonts w:ascii="Liberation Sans" w:hAnsi="Liberation Sans" w:eastAsia="Liberation Sans" w:cs="Liberation Sans"/>
+                <w:rFonts w:ascii="Courier New" w:hAnsi="Courier New" w:eastAsia="Courier New" w:cs="Courier New"/>
                 <w:color w:val="000000"/>
-                <w:sz w:val="24"/>
-                <w:szCs w:val="24"/>
+                <w:sz w:val="20"/>
+                <w:szCs w:val="20"/>
                 <w14:ligatures w14:val="none"/>
               </w:rPr>
             </w:pPr>
             <w:r>
               <w:rPr>
-                <w:rFonts w:ascii="Liberation Sans" w:hAnsi="Liberation Sans" w:eastAsia="Liberation Sans" w:cs="Liberation Sans"/>
+                <w:rFonts w:ascii="Courier New" w:hAnsi="Courier New" w:eastAsia="Courier New" w:cs="Courier New"/>
                 <w:color w:val="000000"/>
-                <w:sz w:val="24"/>
-                <w:szCs w:val="24"/>
+                <w:sz w:val="20"/>
+                <w:szCs w:val="20"/>
+                <w:lang w:val="undefined" w:bidi="undefined"/>
               </w:rPr>
             </w:r>
             <w:r>
               <w:rPr>
-                <w:rFonts w:ascii="Liberation Sans" w:hAnsi="Liberation Sans" w:eastAsia="Liberation Sans" w:cs="Liberation Sans"/>
+                <w:rFonts w:ascii="Courier New" w:hAnsi="Courier New" w:eastAsia="Courier New" w:cs="Courier New"/>
                 <w:color w:val="000000"/>
-                <w:sz w:val="24"/>
-                <w:szCs w:val="24"/>
+                <w:sz w:val="20"/>
+                <w:szCs w:val="20"/>
+                <w:lang w:val="undefined"/>
               </w:rPr>
               <w:t xml:space="preserve">vscode-language-pack-pt-br</w:t>
             </w:r>
             <w:r>
               <w:rPr>
-                <w:rFonts w:ascii="Liberation Sans" w:hAnsi="Liberation Sans" w:eastAsia="Liberation Sans" w:cs="Liberation Sans"/>
+                <w:rFonts w:ascii="Courier New" w:hAnsi="Courier New" w:eastAsia="Courier New" w:cs="Courier New"/>
                 <w:color w:val="000000"/>
-                <w:sz w:val="24"/>
-                <w:szCs w:val="24"/>
-                <w14:ligatures w14:val="none"/>
+                <w:sz w:val="20"/>
+                <w:szCs w:val="20"/>
+                <w:lang w:val="undefined" w:bidi="undefined"/>
               </w:rPr>
             </w:r>
             <w:r>
               <w:rPr>
-                <w:rFonts w:ascii="Liberation Sans" w:hAnsi="Liberation Sans" w:eastAsia="Liberation Sans" w:cs="Liberation Sans"/>
+                <w:rFonts w:ascii="Courier New" w:hAnsi="Courier New" w:eastAsia="Courier New" w:cs="Courier New"/>
                 <w:color w:val="000000"/>
-                <w:sz w:val="24"/>
-                <w:szCs w:val="24"/>
-                <w14:ligatures w14:val="none"/>
+                <w:sz w:val="20"/>
+                <w:szCs w:val="20"/>
+                <w:lang w:val="undefined"/>
               </w:rPr>
             </w:r>
           </w:p>
@@ -916,17 +918,33 @@
               <w:pBdr/>
               <w:spacing w:after="0" w:before="0" w:line="240" w:lineRule="auto"/>
               <w:ind/>
-              <w:rPr/>
+              <w:rPr>
+                <w:rFonts w:ascii="Courier New" w:hAnsi="Courier New" w:eastAsia="Courier New" w:cs="Courier New"/>
+                <w:color w:val="000000"/>
+                <w:sz w:val="20"/>
+                <w:szCs w:val="20"/>
+                <w14:ligatures w14:val="none"/>
+              </w:rPr>
             </w:pPr>
             <w:r>
               <w:rPr>
-                <w:rFonts w:ascii="Liberation Sans" w:hAnsi="Liberation Sans" w:eastAsia="Liberation Sans" w:cs="Liberation Sans"/>
+                <w:rFonts w:ascii="Courier New" w:hAnsi="Courier New" w:eastAsia="Courier New" w:cs="Courier New"/>
                 <w:color w:val="000000"/>
-                <w:sz w:val="24"/>
+                <w:sz w:val="20"/>
+                <w:szCs w:val="20"/>
+                <w:lang w:val="undefined"/>
               </w:rPr>
               <w:t xml:space="preserve">esbenp.prettier-vscode</w:t>
             </w:r>
-            <w:r/>
+            <w:r>
+              <w:rPr>
+                <w:rFonts w:ascii="Courier New" w:hAnsi="Courier New" w:eastAsia="Courier New" w:cs="Courier New"/>
+                <w:color w:val="000000"/>
+                <w:sz w:val="20"/>
+                <w:szCs w:val="20"/>
+                <w:lang w:val="undefined"/>
+              </w:rPr>
+            </w:r>
           </w:p>
         </w:tc>
       </w:tr>
@@ -1030,17 +1048,33 @@
               <w:pBdr/>
               <w:spacing w:after="0" w:before="0" w:line="240" w:lineRule="auto"/>
               <w:ind/>
-              <w:rPr/>
+              <w:rPr>
+                <w:rFonts w:ascii="Courier New" w:hAnsi="Courier New" w:eastAsia="Courier New" w:cs="Courier New"/>
+                <w:color w:val="000000"/>
+                <w:sz w:val="20"/>
+                <w:szCs w:val="20"/>
+                <w14:ligatures w14:val="none"/>
+              </w:rPr>
             </w:pPr>
             <w:r>
               <w:rPr>
-                <w:rFonts w:ascii="Liberation Sans" w:hAnsi="Liberation Sans" w:eastAsia="Liberation Sans" w:cs="Liberation Sans"/>
+                <w:rFonts w:ascii="Courier New" w:hAnsi="Courier New" w:eastAsia="Courier New" w:cs="Courier New"/>
                 <w:color w:val="000000"/>
-                <w:sz w:val="24"/>
+                <w:sz w:val="20"/>
+                <w:szCs w:val="20"/>
+                <w:lang w:val="undefined"/>
               </w:rPr>
               <w:t xml:space="preserve">eamodio.gitlens</w:t>
             </w:r>
-            <w:r/>
+            <w:r>
+              <w:rPr>
+                <w:rFonts w:ascii="Courier New" w:hAnsi="Courier New" w:eastAsia="Courier New" w:cs="Courier New"/>
+                <w:color w:val="000000"/>
+                <w:sz w:val="20"/>
+                <w:szCs w:val="20"/>
+                <w:lang w:val="undefined"/>
+              </w:rPr>
+            </w:r>
           </w:p>
         </w:tc>
       </w:tr>
@@ -1145,37 +1179,39 @@
               <w:spacing w:after="0" w:before="0" w:line="240" w:lineRule="auto"/>
               <w:ind/>
               <w:rPr>
-                <w:rFonts w:ascii="Liberation Sans" w:hAnsi="Liberation Sans" w:eastAsia="Liberation Sans" w:cs="Liberation Sans"/>
+                <w:rFonts w:ascii="Courier New" w:hAnsi="Courier New" w:eastAsia="Courier New" w:cs="Courier New"/>
                 <w:color w:val="000000"/>
-                <w:sz w:val="24"/>
-                <w:szCs w:val="24"/>
+                <w:sz w:val="20"/>
+                <w:szCs w:val="20"/>
                 <w14:ligatures w14:val="none"/>
               </w:rPr>
             </w:pPr>
             <w:r>
               <w:rPr>
-                <w:rFonts w:ascii="Liberation Sans" w:hAnsi="Liberation Sans" w:eastAsia="Liberation Sans" w:cs="Liberation Sans"/>
+                <w:rFonts w:ascii="Courier New" w:hAnsi="Courier New" w:eastAsia="Courier New" w:cs="Courier New"/>
                 <w:color w:val="000000"/>
-                <w:sz w:val="24"/>
-                <w:szCs w:val="24"/>
+                <w:sz w:val="20"/>
+                <w:szCs w:val="20"/>
+                <w:lang w:val="undefined"/>
               </w:rPr>
               <w:t xml:space="preserve">ms-azuretools.vscode-docker</w:t>
             </w:r>
             <w:r>
               <w:rPr>
-                <w:rFonts w:ascii="Liberation Sans" w:hAnsi="Liberation Sans" w:eastAsia="Liberation Sans" w:cs="Liberation Sans"/>
+                <w:rFonts w:ascii="Courier New" w:hAnsi="Courier New" w:eastAsia="Courier New" w:cs="Courier New"/>
                 <w:color w:val="000000"/>
-                <w:sz w:val="24"/>
-                <w:szCs w:val="24"/>
+                <w:sz w:val="20"/>
+                <w:szCs w:val="20"/>
+                <w:lang w:val="undefined" w:bidi="undefined"/>
               </w:rPr>
             </w:r>
             <w:r>
               <w:rPr>
-                <w:rFonts w:ascii="Liberation Sans" w:hAnsi="Liberation Sans" w:eastAsia="Liberation Sans" w:cs="Liberation Sans"/>
+                <w:rFonts w:ascii="Courier New" w:hAnsi="Courier New" w:eastAsia="Courier New" w:cs="Courier New"/>
                 <w:color w:val="000000"/>
-                <w:sz w:val="24"/>
-                <w:szCs w:val="24"/>
-                <w14:ligatures w14:val="none"/>
+                <w:sz w:val="20"/>
+                <w:szCs w:val="20"/>
+                <w:lang w:val="undefined"/>
               </w:rPr>
             </w:r>
           </w:p>
@@ -1299,6 +1335,7 @@
                 <w:color w:val="000000"/>
                 <w:sz w:val="24"/>
                 <w:szCs w:val="24"/>
+                <w14:ligatures w14:val="none"/>
               </w:rPr>
             </w:r>
             <w:r>
@@ -1336,45 +1373,48 @@
               <w:spacing w:after="0" w:before="0" w:line="240" w:lineRule="auto"/>
               <w:ind/>
               <w:rPr>
-                <w:rFonts w:ascii="Liberation Sans" w:hAnsi="Liberation Sans" w:eastAsia="Liberation Sans" w:cs="Liberation Sans"/>
+                <w:rFonts w:ascii="Courier New" w:hAnsi="Courier New" w:eastAsia="Courier New" w:cs="Courier New"/>
                 <w:color w:val="000000"/>
-                <w:sz w:val="24"/>
-                <w:szCs w:val="24"/>
+                <w:sz w:val="20"/>
+                <w:szCs w:val="20"/>
                 <w14:ligatures w14:val="none"/>
               </w:rPr>
             </w:pPr>
             <w:r>
               <w:rPr>
-                <w:rFonts w:ascii="Liberation Sans" w:hAnsi="Liberation Sans" w:eastAsia="Liberation Sans" w:cs="Liberation Sans"/>
+                <w:rFonts w:ascii="Courier New" w:hAnsi="Courier New" w:eastAsia="Courier New" w:cs="Courier New"/>
                 <w:color w:val="000000"/>
-                <w:sz w:val="24"/>
-                <w:szCs w:val="24"/>
+                <w:sz w:val="20"/>
+                <w:szCs w:val="20"/>
+                <w:lang w:val="undefined" w:bidi="undefined"/>
               </w:rPr>
             </w:r>
             <w:r>
               <w:rPr>
-                <w:rFonts w:ascii="Liberation Sans" w:hAnsi="Liberation Sans" w:eastAsia="Liberation Sans" w:cs="Liberation Sans"/>
+                <w:rFonts w:ascii="Courier New" w:hAnsi="Courier New" w:eastAsia="Courier New" w:cs="Courier New"/>
                 <w:color w:val="000000"/>
-                <w:sz w:val="24"/>
-                <w:szCs w:val="24"/>
+                <w:sz w:val="20"/>
+                <w:szCs w:val="20"/>
+                <w:lang w:val="undefined"/>
               </w:rPr>
               <w:t xml:space="preserve">ms-vscode-remote.remote-containers</w:t>
             </w:r>
             <w:r>
               <w:rPr>
-                <w:rFonts w:ascii="Liberation Sans" w:hAnsi="Liberation Sans" w:eastAsia="Liberation Sans" w:cs="Liberation Sans"/>
+                <w:rFonts w:ascii="Courier New" w:hAnsi="Courier New" w:eastAsia="Courier New" w:cs="Courier New"/>
                 <w:color w:val="000000"/>
-                <w:sz w:val="24"/>
-                <w:szCs w:val="24"/>
+                <w:sz w:val="20"/>
+                <w:szCs w:val="20"/>
+                <w:lang w:val="undefined" w:bidi="undefined"/>
               </w:rPr>
             </w:r>
             <w:r>
               <w:rPr>
-                <w:rFonts w:ascii="Liberation Sans" w:hAnsi="Liberation Sans" w:eastAsia="Liberation Sans" w:cs="Liberation Sans"/>
+                <w:rFonts w:ascii="Courier New" w:hAnsi="Courier New" w:eastAsia="Courier New" w:cs="Courier New"/>
                 <w:color w:val="000000"/>
-                <w:sz w:val="24"/>
-                <w:szCs w:val="24"/>
-                <w14:ligatures w14:val="none"/>
+                <w:sz w:val="20"/>
+                <w:szCs w:val="20"/>
+                <w:lang w:val="undefined"/>
               </w:rPr>
             </w:r>
           </w:p>
@@ -1480,17 +1520,33 @@
               <w:pBdr/>
               <w:spacing w:after="0" w:before="0" w:line="240" w:lineRule="auto"/>
               <w:ind/>
-              <w:rPr/>
+              <w:rPr>
+                <w:rFonts w:ascii="Courier New" w:hAnsi="Courier New" w:eastAsia="Courier New" w:cs="Courier New"/>
+                <w:color w:val="000000"/>
+                <w:sz w:val="20"/>
+                <w:szCs w:val="20"/>
+                <w14:ligatures w14:val="none"/>
+              </w:rPr>
             </w:pPr>
             <w:r>
               <w:rPr>
-                <w:rFonts w:ascii="Liberation Sans" w:hAnsi="Liberation Sans" w:eastAsia="Liberation Sans" w:cs="Liberation Sans"/>
+                <w:rFonts w:ascii="Courier New" w:hAnsi="Courier New" w:eastAsia="Courier New" w:cs="Courier New"/>
                 <w:color w:val="000000"/>
-                <w:sz w:val="24"/>
+                <w:sz w:val="20"/>
+                <w:szCs w:val="20"/>
+                <w:lang w:val="undefined"/>
               </w:rPr>
               <w:t xml:space="preserve">editorconfig.editorconfig</w:t>
             </w:r>
-            <w:r/>
+            <w:r>
+              <w:rPr>
+                <w:rFonts w:ascii="Courier New" w:hAnsi="Courier New" w:eastAsia="Courier New" w:cs="Courier New"/>
+                <w:color w:val="000000"/>
+                <w:sz w:val="20"/>
+                <w:szCs w:val="20"/>
+                <w:lang w:val="undefined"/>
+              </w:rPr>
+            </w:r>
           </w:p>
         </w:tc>
       </w:tr>
@@ -1594,17 +1650,33 @@
               <w:pBdr/>
               <w:spacing w:after="0" w:before="0" w:line="240" w:lineRule="auto"/>
               <w:ind/>
-              <w:rPr/>
+              <w:rPr>
+                <w:rFonts w:ascii="Courier New" w:hAnsi="Courier New" w:eastAsia="Courier New" w:cs="Courier New"/>
+                <w:color w:val="000000"/>
+                <w:sz w:val="20"/>
+                <w:szCs w:val="20"/>
+                <w14:ligatures w14:val="none"/>
+              </w:rPr>
             </w:pPr>
             <w:r>
               <w:rPr>
-                <w:rFonts w:ascii="Liberation Sans" w:hAnsi="Liberation Sans" w:eastAsia="Liberation Sans" w:cs="Liberation Sans"/>
+                <w:rFonts w:ascii="Courier New" w:hAnsi="Courier New" w:eastAsia="Courier New" w:cs="Courier New"/>
                 <w:color w:val="000000"/>
-                <w:sz w:val="24"/>
+                <w:sz w:val="20"/>
+                <w:szCs w:val="20"/>
+                <w:lang w:val="undefined"/>
               </w:rPr>
               <w:t xml:space="preserve">usernamehw.errorlens</w:t>
             </w:r>
-            <w:r/>
+            <w:r>
+              <w:rPr>
+                <w:rFonts w:ascii="Courier New" w:hAnsi="Courier New" w:eastAsia="Courier New" w:cs="Courier New"/>
+                <w:color w:val="000000"/>
+                <w:sz w:val="20"/>
+                <w:szCs w:val="20"/>
+                <w:lang w:val="undefined"/>
+              </w:rPr>
+            </w:r>
           </w:p>
         </w:tc>
       </w:tr>
@@ -1708,17 +1780,33 @@
               <w:pBdr/>
               <w:spacing w:after="0" w:before="0" w:line="240" w:lineRule="auto"/>
               <w:ind/>
-              <w:rPr/>
+              <w:rPr>
+                <w:rFonts w:ascii="Courier New" w:hAnsi="Courier New" w:eastAsia="Courier New" w:cs="Courier New"/>
+                <w:color w:val="000000"/>
+                <w:sz w:val="20"/>
+                <w:szCs w:val="20"/>
+                <w14:ligatures w14:val="none"/>
+              </w:rPr>
             </w:pPr>
             <w:r>
               <w:rPr>
-                <w:rFonts w:ascii="Liberation Sans" w:hAnsi="Liberation Sans" w:eastAsia="Liberation Sans" w:cs="Liberation Sans"/>
+                <w:rFonts w:ascii="Courier New" w:hAnsi="Courier New" w:eastAsia="Courier New" w:cs="Courier New"/>
                 <w:color w:val="000000"/>
-                <w:sz w:val="24"/>
+                <w:sz w:val="20"/>
+                <w:szCs w:val="20"/>
+                <w:lang w:val="undefined"/>
               </w:rPr>
               <w:t xml:space="preserve">pkief.material-icon-theme</w:t>
             </w:r>
-            <w:r/>
+            <w:r>
+              <w:rPr>
+                <w:rFonts w:ascii="Courier New" w:hAnsi="Courier New" w:eastAsia="Courier New" w:cs="Courier New"/>
+                <w:color w:val="000000"/>
+                <w:sz w:val="20"/>
+                <w:szCs w:val="20"/>
+                <w:lang w:val="undefined"/>
+              </w:rPr>
+            </w:r>
           </w:p>
         </w:tc>
       </w:tr>
@@ -1822,17 +1910,229 @@
               <w:pBdr/>
               <w:spacing w:after="0" w:before="0" w:line="240" w:lineRule="auto"/>
               <w:ind/>
-              <w:rPr/>
+              <w:rPr>
+                <w:rFonts w:ascii="Courier New" w:hAnsi="Courier New" w:eastAsia="Courier New" w:cs="Courier New"/>
+                <w:color w:val="000000"/>
+                <w:sz w:val="20"/>
+                <w:szCs w:val="20"/>
+                <w14:ligatures w14:val="none"/>
+              </w:rPr>
+            </w:pPr>
+            <w:r>
+              <w:rPr>
+                <w:rFonts w:ascii="Courier New" w:hAnsi="Courier New" w:eastAsia="Courier New" w:cs="Courier New"/>
+                <w:color w:val="000000"/>
+                <w:sz w:val="20"/>
+                <w:szCs w:val="20"/>
+                <w:lang w:val="undefined"/>
+              </w:rPr>
+              <w:t xml:space="preserve">streetsidesoftware.code-spell-checker</w:t>
+            </w:r>
+            <w:r>
+              <w:rPr>
+                <w:rFonts w:ascii="Courier New" w:hAnsi="Courier New" w:eastAsia="Courier New" w:cs="Courier New"/>
+                <w:color w:val="000000"/>
+                <w:sz w:val="20"/>
+                <w:szCs w:val="20"/>
+                <w:lang w:val="undefined"/>
+              </w:rPr>
+            </w:r>
+          </w:p>
+        </w:tc>
+      </w:tr>
+      <w:tr>
+        <w:trPr/>
+        <w:tc>
+          <w:tcPr>
+            <w:tcBorders>
+              <w:top w:val="single" w:color="000000" w:sz="6" w:space="0"/>
+              <w:left w:val="single" w:color="000000" w:sz="6" w:space="0"/>
+              <w:bottom w:val="single" w:color="000000" w:sz="6" w:space="0"/>
+              <w:right w:val="single" w:color="000000" w:sz="6" w:space="0"/>
+            </w:tcBorders>
+            <w:tcMar>
+              <w:left w:w="15" w:type="dxa"/>
+              <w:top w:w="15" w:type="dxa"/>
+              <w:right w:w="15" w:type="dxa"/>
+              <w:bottom w:w="15" w:type="dxa"/>
+            </w:tcMar>
+            <w:tcW w:w="1842" w:type="dxa"/>
+            <w:vAlign w:val="center"/>
+            <w:vMerge w:val="restart"/>
+          </w:tcPr>
+          <w:p>
+            <w:pPr>
+              <w:pBdr/>
+              <w:spacing w:after="0" w:before="0" w:line="240" w:lineRule="auto"/>
+              <w:ind/>
+              <w:rPr>
+                <w:rFonts w:ascii="Liberation Sans" w:hAnsi="Liberation Sans" w:eastAsia="Liberation Sans" w:cs="Liberation Sans"/>
+                <w:b/>
+                <w:bCs/>
+                <w:color w:val="000000"/>
+                <w:sz w:val="24"/>
+                <w:szCs w:val="24"/>
+                <w14:ligatures w14:val="none"/>
+              </w:rPr>
+            </w:pPr>
+            <w:r>
+              <w:rPr>
+                <w:rFonts w:ascii="Liberation Sans" w:hAnsi="Liberation Sans" w:eastAsia="Liberation Sans" w:cs="Liberation Sans"/>
+                <w:b/>
+                <w:bCs/>
+                <w:color w:val="000000"/>
+                <w:sz w:val="24"/>
+                <w:szCs w:val="24"/>
+              </w:rPr>
+              <w:t xml:space="preserve">YAML</w:t>
+            </w:r>
+            <w:r>
+              <w:rPr>
+                <w:rFonts w:ascii="Liberation Sans" w:hAnsi="Liberation Sans" w:eastAsia="Liberation Sans" w:cs="Liberation Sans"/>
+                <w:b/>
+                <w:bCs/>
+                <w:color w:val="000000"/>
+                <w:sz w:val="24"/>
+                <w:szCs w:val="24"/>
+                <w14:ligatures w14:val="none"/>
+              </w:rPr>
+            </w:r>
+            <w:r>
+              <w:rPr>
+                <w:rFonts w:ascii="Liberation Sans" w:hAnsi="Liberation Sans" w:eastAsia="Liberation Sans" w:cs="Liberation Sans"/>
+                <w:b/>
+                <w:bCs/>
+                <w:color w:val="000000"/>
+                <w:sz w:val="24"/>
+                <w:szCs w:val="24"/>
+                <w14:ligatures w14:val="none"/>
+              </w:rPr>
+            </w:r>
+          </w:p>
+        </w:tc>
+        <w:tc>
+          <w:tcPr>
+            <w:tcBorders>
+              <w:top w:val="single" w:color="000000" w:sz="6" w:space="0"/>
+              <w:left w:val="single" w:color="000000" w:sz="6" w:space="0"/>
+              <w:bottom w:val="single" w:color="000000" w:sz="6" w:space="0"/>
+              <w:right w:val="single" w:color="000000" w:sz="6" w:space="0"/>
+            </w:tcBorders>
+            <w:tcMar>
+              <w:left w:w="15" w:type="dxa"/>
+              <w:top w:w="15" w:type="dxa"/>
+              <w:right w:w="15" w:type="dxa"/>
+              <w:bottom w:w="15" w:type="dxa"/>
+            </w:tcMar>
+            <w:tcW w:w="3579" w:type="dxa"/>
+            <w:vAlign w:val="center"/>
+            <w:vMerge w:val="restart"/>
+          </w:tcPr>
+          <w:p>
+            <w:pPr>
+              <w:pBdr>
+                <w:top w:val="none" w:color="000000" w:sz="4" w:space="0"/>
+                <w:left w:val="none" w:color="000000" w:sz="4" w:space="0"/>
+                <w:bottom w:val="none" w:color="000000" w:sz="4" w:space="0"/>
+                <w:right w:val="none" w:color="000000" w:sz="4" w:space="0"/>
+              </w:pBdr>
+              <w:spacing w:after="0" w:before="0" w:line="276" w:lineRule="auto"/>
+              <w:ind w:right="0" w:firstLine="0" w:left="0"/>
+              <w:rPr>
+                <w:rFonts w:ascii="Liberation Sans" w:hAnsi="Liberation Sans" w:eastAsia="Liberation Sans" w:cs="Liberation Sans"/>
+                <w:color w:val="000000"/>
+                <w:sz w:val="24"/>
+                <w:szCs w:val="24"/>
+                <w14:ligatures w14:val="none"/>
+              </w:rPr>
             </w:pPr>
             <w:r>
               <w:rPr>
                 <w:rFonts w:ascii="Liberation Sans" w:hAnsi="Liberation Sans" w:eastAsia="Liberation Sans" w:cs="Liberation Sans"/>
                 <w:color w:val="000000"/>
                 <w:sz w:val="24"/>
+                <w:szCs w:val="24"/>
               </w:rPr>
-              <w:t xml:space="preserve">streetsidesoftware.code-spell-checker</w:t>
+              <w:t xml:space="preserve">Validação e suporte a schemas YAML.</w:t>
             </w:r>
-            <w:r/>
+            <w:r>
+              <w:rPr>
+                <w:rFonts w:ascii="Liberation Sans" w:hAnsi="Liberation Sans" w:eastAsia="Liberation Sans" w:cs="Liberation Sans"/>
+                <w:color w:val="000000"/>
+                <w:sz w:val="24"/>
+                <w:szCs w:val="24"/>
+                <w14:ligatures w14:val="none"/>
+              </w:rPr>
+            </w:r>
+            <w:r>
+              <w:rPr>
+                <w:rFonts w:ascii="Liberation Sans" w:hAnsi="Liberation Sans" w:eastAsia="Liberation Sans" w:cs="Liberation Sans"/>
+                <w:color w:val="000000"/>
+                <w:sz w:val="24"/>
+                <w:szCs w:val="24"/>
+                <w14:ligatures w14:val="none"/>
+              </w:rPr>
+            </w:r>
+          </w:p>
+        </w:tc>
+        <w:tc>
+          <w:tcPr>
+            <w:tcBorders>
+              <w:top w:val="single" w:color="000000" w:sz="6" w:space="0"/>
+              <w:left w:val="single" w:color="000000" w:sz="6" w:space="0"/>
+              <w:bottom w:val="single" w:color="000000" w:sz="6" w:space="0"/>
+              <w:right w:val="single" w:color="000000" w:sz="6" w:space="0"/>
+            </w:tcBorders>
+            <w:tcMar>
+              <w:left w:w="15" w:type="dxa"/>
+              <w:top w:w="15" w:type="dxa"/>
+              <w:right w:w="15" w:type="dxa"/>
+              <w:bottom w:w="15" w:type="dxa"/>
+            </w:tcMar>
+            <w:tcW w:w="3083" w:type="dxa"/>
+            <w:vAlign w:val="center"/>
+            <w:vMerge w:val="restart"/>
+          </w:tcPr>
+          <w:p>
+            <w:pPr>
+              <w:pBdr/>
+              <w:spacing w:after="0" w:before="0" w:line="240" w:lineRule="auto"/>
+              <w:ind/>
+              <w:rPr>
+                <w:rFonts w:ascii="Courier New" w:hAnsi="Courier New" w:eastAsia="Courier New" w:cs="Courier New"/>
+                <w:color w:val="000000"/>
+                <w:sz w:val="20"/>
+                <w:szCs w:val="20"/>
+                <w14:ligatures w14:val="none"/>
+              </w:rPr>
+            </w:pPr>
+            <w:r>
+              <w:rPr>
+                <w:rFonts w:ascii="Courier New" w:hAnsi="Courier New" w:eastAsia="Courier New" w:cs="Courier New"/>
+                <w:color w:val="000000"/>
+                <w:sz w:val="20"/>
+                <w:szCs w:val="20"/>
+              </w:rPr>
+              <w:t xml:space="preserve">redhat.vscode-yaml</w:t>
+            </w:r>
+            <w:r>
+              <w:rPr>
+                <w:rFonts w:ascii="Courier New" w:hAnsi="Courier New" w:eastAsia="Courier New" w:cs="Courier New"/>
+                <w:color w:val="000000"/>
+                <w:sz w:val="20"/>
+                <w:szCs w:val="20"/>
+                <w14:ligatures w14:val="none"/>
+              </w:rPr>
+            </w:r>
+            <w:r>
+              <w:rPr>
+                <w:rFonts w:ascii="Courier New" w:hAnsi="Courier New" w:eastAsia="Courier New" w:cs="Courier New"/>
+                <w:color w:val="000000"/>
+                <w:sz w:val="20"/>
+                <w:szCs w:val="20"/>
+                <w14:ligatures w14:val="none"/>
+              </w:rPr>
+            </w:r>
           </w:p>
         </w:tc>
       </w:tr>
@@ -2594,6 +2894,7 @@
           <w:color w:val="000000"/>
           <w:sz w:val="20"/>
           <w:szCs w:val="20"/>
+          <w:highlight w:val="none"/>
           <w14:ligatures w14:val="none"/>
         </w:rPr>
       </w:pPr>
@@ -2623,6 +2924,230 @@
           <w:szCs w:val="20"/>
           <w14:ligatures w14:val="none"/>
         </w:rPr>
+        <w:t xml:space="preserve">,</w:t>
+      </w:r>
+      <w:r>
+        <w:rPr>
+          <w:rFonts w:ascii="Courier New" w:hAnsi="Courier New" w:eastAsia="Courier New" w:cs="Courier New"/>
+          <w:color w:val="000000"/>
+          <w:sz w:val="20"/>
+          <w:szCs w:val="20"/>
+          <w14:ligatures w14:val="none"/>
+        </w:rPr>
+      </w:r>
+    </w:p>
+    <w:p>
+      <w:pPr>
+        <w:pBdr>
+          <w:top w:val="none" w:color="000000" w:sz="4" w:space="0"/>
+          <w:left w:val="none" w:color="000000" w:sz="4" w:space="0"/>
+          <w:bottom w:val="none" w:color="000000" w:sz="4" w:space="0"/>
+          <w:right w:val="none" w:color="000000" w:sz="4" w:space="0"/>
+        </w:pBdr>
+        <w:spacing/>
+        <w:ind w:right="0" w:firstLine="0" w:left="0"/>
+        <w:rPr>
+          <w:rFonts w:ascii="Courier New" w:hAnsi="Courier New" w:eastAsia="Courier New" w:cs="Courier New"/>
+          <w:color w:val="000000"/>
+          <w:sz w:val="20"/>
+          <w:szCs w:val="20"/>
+          <w14:ligatures w14:val="none"/>
+        </w:rPr>
+      </w:pPr>
+      <w:r>
+        <w:rPr>
+          <w:rFonts w:ascii="Courier New" w:hAnsi="Courier New" w:eastAsia="Courier New" w:cs="Courier New"/>
+          <w:color w:val="000000"/>
+          <w:sz w:val="20"/>
+          <w:szCs w:val="20"/>
+        </w:rPr>
+        <w:t xml:space="preserve">   "yaml.validate":true,</w:t>
+      </w:r>
+      <w:r>
+        <w:rPr>
+          <w:rFonts w:ascii="Courier New" w:hAnsi="Courier New" w:eastAsia="Courier New" w:cs="Courier New"/>
+          <w:color w:val="000000"/>
+          <w:sz w:val="20"/>
+          <w:szCs w:val="20"/>
+          <w14:ligatures w14:val="none"/>
+        </w:rPr>
+      </w:r>
+      <w:r>
+        <w:rPr>
+          <w:rFonts w:ascii="Courier New" w:hAnsi="Courier New" w:eastAsia="Courier New" w:cs="Courier New"/>
+          <w:color w:val="000000"/>
+          <w:sz w:val="20"/>
+          <w:szCs w:val="20"/>
+          <w14:ligatures w14:val="none"/>
+        </w:rPr>
+      </w:r>
+    </w:p>
+    <w:p>
+      <w:pPr>
+        <w:pBdr>
+          <w:top w:val="none" w:color="000000" w:sz="4" w:space="0"/>
+          <w:left w:val="none" w:color="000000" w:sz="4" w:space="0"/>
+          <w:bottom w:val="none" w:color="000000" w:sz="4" w:space="0"/>
+          <w:right w:val="none" w:color="000000" w:sz="4" w:space="0"/>
+        </w:pBdr>
+        <w:spacing/>
+        <w:ind w:right="0" w:firstLine="0" w:left="0"/>
+        <w:rPr>
+          <w:rFonts w:ascii="Courier New" w:hAnsi="Courier New" w:eastAsia="Courier New" w:cs="Courier New"/>
+          <w:color w:val="000000"/>
+          <w:sz w:val="20"/>
+          <w:szCs w:val="20"/>
+          <w14:ligatures w14:val="none"/>
+        </w:rPr>
+      </w:pPr>
+      <w:r>
+        <w:rPr>
+          <w:rFonts w:ascii="Courier New" w:hAnsi="Courier New" w:eastAsia="Courier New" w:cs="Courier New"/>
+          <w:color w:val="000000"/>
+          <w:sz w:val="20"/>
+          <w:szCs w:val="20"/>
+        </w:rPr>
+        <w:t xml:space="preserve">   "files.associations":{</w:t>
+      </w:r>
+      <w:r>
+        <w:rPr>
+          <w:rFonts w:ascii="Courier New" w:hAnsi="Courier New" w:eastAsia="Courier New" w:cs="Courier New"/>
+          <w:color w:val="000000"/>
+          <w:sz w:val="20"/>
+          <w:szCs w:val="20"/>
+          <w14:ligatures w14:val="none"/>
+        </w:rPr>
+      </w:r>
+      <w:r>
+        <w:rPr>
+          <w:rFonts w:ascii="Courier New" w:hAnsi="Courier New" w:eastAsia="Courier New" w:cs="Courier New"/>
+          <w:color w:val="000000"/>
+          <w:sz w:val="20"/>
+          <w:szCs w:val="20"/>
+          <w14:ligatures w14:val="none"/>
+        </w:rPr>
+      </w:r>
+    </w:p>
+    <w:p>
+      <w:pPr>
+        <w:pBdr>
+          <w:top w:val="none" w:color="000000" w:sz="4" w:space="0"/>
+          <w:left w:val="none" w:color="000000" w:sz="4" w:space="0"/>
+          <w:bottom w:val="none" w:color="000000" w:sz="4" w:space="0"/>
+          <w:right w:val="none" w:color="000000" w:sz="4" w:space="0"/>
+        </w:pBdr>
+        <w:spacing/>
+        <w:ind w:right="0" w:firstLine="0" w:left="0"/>
+        <w:rPr>
+          <w:rFonts w:ascii="Courier New" w:hAnsi="Courier New" w:eastAsia="Courier New" w:cs="Courier New"/>
+          <w:color w:val="000000"/>
+          <w:sz w:val="20"/>
+          <w:szCs w:val="20"/>
+          <w14:ligatures w14:val="none"/>
+        </w:rPr>
+      </w:pPr>
+      <w:r>
+        <w:rPr>
+          <w:rFonts w:ascii="Courier New" w:hAnsi="Courier New" w:eastAsia="Courier New" w:cs="Courier New"/>
+          <w:color w:val="000000"/>
+          <w:sz w:val="20"/>
+          <w:szCs w:val="20"/>
+        </w:rPr>
+        <w:t xml:space="preserve">      "*.yml":"yaml"</w:t>
+      </w:r>
+      <w:r>
+        <w:rPr>
+          <w:rFonts w:ascii="Courier New" w:hAnsi="Courier New" w:eastAsia="Courier New" w:cs="Courier New"/>
+          <w:color w:val="000000"/>
+          <w:sz w:val="20"/>
+          <w:szCs w:val="20"/>
+          <w14:ligatures w14:val="none"/>
+        </w:rPr>
+      </w:r>
+      <w:r>
+        <w:rPr>
+          <w:rFonts w:ascii="Courier New" w:hAnsi="Courier New" w:eastAsia="Courier New" w:cs="Courier New"/>
+          <w:color w:val="000000"/>
+          <w:sz w:val="20"/>
+          <w:szCs w:val="20"/>
+          <w14:ligatures w14:val="none"/>
+        </w:rPr>
+      </w:r>
+    </w:p>
+    <w:p>
+      <w:pPr>
+        <w:pBdr>
+          <w:top w:val="none" w:color="000000" w:sz="4" w:space="0"/>
+          <w:left w:val="none" w:color="000000" w:sz="4" w:space="0"/>
+          <w:bottom w:val="none" w:color="000000" w:sz="4" w:space="0"/>
+          <w:right w:val="none" w:color="000000" w:sz="4" w:space="0"/>
+        </w:pBdr>
+        <w:spacing/>
+        <w:ind w:right="0" w:firstLine="0" w:left="0"/>
+        <w:rPr>
+          <w:rFonts w:ascii="Courier New" w:hAnsi="Courier New" w:eastAsia="Courier New" w:cs="Courier New"/>
+          <w:color w:val="000000"/>
+          <w:sz w:val="20"/>
+          <w:szCs w:val="20"/>
+          <w14:ligatures w14:val="none"/>
+        </w:rPr>
+      </w:pPr>
+      <w:r>
+        <w:rPr>
+          <w:rFonts w:ascii="Courier New" w:hAnsi="Courier New" w:eastAsia="Courier New" w:cs="Courier New"/>
+          <w:color w:val="000000"/>
+          <w:sz w:val="20"/>
+          <w:szCs w:val="20"/>
+        </w:rPr>
+        <w:t xml:space="preserve">   },</w:t>
+      </w:r>
+      <w:r>
+        <w:rPr>
+          <w:rFonts w:ascii="Courier New" w:hAnsi="Courier New" w:eastAsia="Courier New" w:cs="Courier New"/>
+          <w:color w:val="000000"/>
+          <w:sz w:val="20"/>
+          <w:szCs w:val="20"/>
+          <w14:ligatures w14:val="none"/>
+        </w:rPr>
+      </w:r>
+      <w:r>
+        <w:rPr>
+          <w:rFonts w:ascii="Courier New" w:hAnsi="Courier New" w:eastAsia="Courier New" w:cs="Courier New"/>
+          <w:color w:val="000000"/>
+          <w:sz w:val="20"/>
+          <w:szCs w:val="20"/>
+          <w14:ligatures w14:val="none"/>
+        </w:rPr>
+      </w:r>
+      <w:r>
+        <w:rPr>
+          <w:rFonts w:ascii="Courier New" w:hAnsi="Courier New" w:eastAsia="Courier New" w:cs="Courier New"/>
+          <w:color w:val="000000"/>
+          <w:sz w:val="20"/>
+          <w:szCs w:val="20"/>
+          <w:highlight w:val="none"/>
+          <w14:ligatures w14:val="none"/>
+        </w:rPr>
+      </w:r>
+      <w:r>
+        <w:rPr>
+          <w:rFonts w:ascii="Courier New" w:hAnsi="Courier New" w:eastAsia="Courier New" w:cs="Courier New"/>
+          <w:color w:val="000000"/>
+          <w:sz w:val="20"/>
+          <w:szCs w:val="20"/>
+          <w:highlight w:val="none"/>
+          <w14:ligatures w14:val="none"/>
+        </w:rPr>
+      </w:r>
+      <w:r>
+        <w:rPr>
+          <w:rFonts w:ascii="Courier New" w:hAnsi="Courier New" w:eastAsia="Courier New" w:cs="Courier New"/>
+          <w:color w:val="000000"/>
+          <w:sz w:val="20"/>
+          <w:szCs w:val="20"/>
+          <w:highlight w:val="none"/>
+          <w14:ligatures w14:val="none"/>
+        </w:rPr>
       </w:r>
       <w:r>
         <w:rPr>
@@ -2711,7 +3236,7 @@
     </w:p>
     <w:p>
       <w:pPr>
-        <w:pStyle w:val="857"/>
+        <w:pStyle w:val="859"/>
         <w:pBdr>
           <w:top w:val="none" w:color="000000" w:sz="4" w:space="0"/>
           <w:left w:val="none" w:color="000000" w:sz="4" w:space="0"/>
@@ -2783,7 +3308,7 @@
     </w:p>
     <w:tbl>
       <w:tblPr>
-        <w:tblStyle w:val="729"/>
+        <w:tblStyle w:val="731"/>
         <w:tblInd w:w="0" w:type="dxa"/>
         <w:tblW w:w="0" w:type="auto"/>
         <w:tblBorders>
@@ -3709,44 +4234,6 @@
       <w:r>
         <w:rPr>
           <w:rFonts w:ascii="Liberation Sans" w:hAnsi="Liberation Sans" w:eastAsia="Liberation Sans" w:cs="Liberation Sans"/>
-          <w:sz w:val="24"/>
-          <w:szCs w:val="24"/>
-        </w:rPr>
-      </w:r>
-      <w:r>
-        <w:rPr>
-          <w:rFonts w:ascii="Liberation Sans" w:hAnsi="Liberation Sans" w:eastAsia="Liberation Sans" w:cs="Liberation Sans"/>
-          <w:sz w:val="24"/>
-          <w:szCs w:val="24"/>
-        </w:rPr>
-      </w:r>
-      <w:r>
-        <w:rPr>
-          <w:rFonts w:ascii="Liberation Sans" w:hAnsi="Liberation Sans" w:eastAsia="Liberation Sans" w:cs="Liberation Sans"/>
-          <w:sz w:val="24"/>
-          <w:szCs w:val="24"/>
-        </w:rPr>
-      </w:r>
-    </w:p>
-    <w:p>
-      <w:pPr>
-        <w:pBdr>
-          <w:top w:val="none" w:color="000000" w:sz="4" w:space="0"/>
-          <w:left w:val="none" w:color="000000" w:sz="4" w:space="0"/>
-          <w:bottom w:val="none" w:color="000000" w:sz="4" w:space="0"/>
-          <w:right w:val="none" w:color="000000" w:sz="4" w:space="0"/>
-        </w:pBdr>
-        <w:spacing w:before="0" w:line="276" w:lineRule="auto"/>
-        <w:ind w:right="0" w:firstLine="0" w:left="0"/>
-        <w:rPr>
-          <w:rFonts w:ascii="Liberation Sans" w:hAnsi="Liberation Sans" w:eastAsia="Liberation Sans" w:cs="Liberation Sans"/>
-          <w:sz w:val="24"/>
-          <w:szCs w:val="24"/>
-        </w:rPr>
-      </w:pPr>
-      <w:r>
-        <w:rPr>
-          <w:rFonts w:ascii="Liberation Sans" w:hAnsi="Liberation Sans" w:eastAsia="Liberation Sans" w:cs="Liberation Sans"/>
           <w:color w:val="000000"/>
           <w:sz w:val="24"/>
           <w:highlight w:val="none"/>
@@ -3769,7 +4256,7 @@
     </w:p>
     <w:p>
       <w:pPr>
-        <w:pStyle w:val="857"/>
+        <w:pStyle w:val="859"/>
         <w:pBdr>
           <w:top w:val="none" w:color="000000" w:sz="4" w:space="0"/>
           <w:left w:val="none" w:color="000000" w:sz="4" w:space="0"/>
@@ -3841,7 +4328,7 @@
     </w:p>
     <w:tbl>
       <w:tblPr>
-        <w:tblStyle w:val="729"/>
+        <w:tblStyle w:val="731"/>
         <w:tblInd w:w="0" w:type="dxa"/>
         <w:tblW w:w="0" w:type="auto"/>
         <w:tblBorders>
@@ -5331,7 +5818,7 @@
     </w:p>
     <w:p>
       <w:pPr>
-        <w:pStyle w:val="857"/>
+        <w:pStyle w:val="859"/>
         <w:pBdr>
           <w:top w:val="none" w:color="000000" w:sz="4" w:space="0"/>
           <w:left w:val="none" w:color="000000" w:sz="4" w:space="0"/>
@@ -5403,7 +5890,7 @@
     </w:p>
     <w:tbl>
       <w:tblPr>
-        <w:tblStyle w:val="729"/>
+        <w:tblStyle w:val="731"/>
         <w:tblInd w:w="0" w:type="dxa"/>
         <w:tblW w:w="0" w:type="auto"/>
         <w:tblBorders>
@@ -7365,7 +7852,7 @@
     </w:p>
     <w:p>
       <w:pPr>
-        <w:pStyle w:val="857"/>
+        <w:pStyle w:val="859"/>
         <w:pBdr>
           <w:top w:val="none" w:color="000000" w:sz="4" w:space="0"/>
           <w:left w:val="none" w:color="000000" w:sz="4" w:space="0"/>
@@ -7420,7 +7907,7 @@
     </w:p>
     <w:tbl>
       <w:tblPr>
-        <w:tblStyle w:val="729"/>
+        <w:tblStyle w:val="731"/>
         <w:tblInd w:w="0" w:type="dxa"/>
         <w:tblW w:w="0" w:type="auto"/>
         <w:tblBorders>
@@ -7463,18 +7950,39 @@
               <w:pBdr/>
               <w:spacing w:after="0" w:before="0" w:line="240" w:lineRule="auto"/>
               <w:ind/>
-              <w:rPr/>
+              <w:rPr>
+                <w:rFonts w:ascii="Liberation Sans" w:hAnsi="Liberation Sans" w:eastAsia="Liberation Sans" w:cs="Liberation Sans"/>
+                <w:b/>
+                <w:bCs/>
+                <w:color w:val="000000"/>
+                <w:sz w:val="24"/>
+                <w:szCs w:val="24"/>
+                <w14:ligatures w14:val="none"/>
+              </w:rPr>
             </w:pPr>
             <w:r>
               <w:rPr>
                 <w:rFonts w:ascii="Liberation Sans" w:hAnsi="Liberation Sans" w:eastAsia="Liberation Sans" w:cs="Liberation Sans"/>
                 <w:b/>
+                <w:bCs/>
                 <w:color w:val="000000"/>
                 <w:sz w:val="24"/>
+                <w:szCs w:val="24"/>
+                <w:lang w:val="undefined"/>
               </w:rPr>
               <w:t xml:space="preserve">Extensão</w:t>
             </w:r>
-            <w:r/>
+            <w:r>
+              <w:rPr>
+                <w:rFonts w:ascii="Liberation Sans" w:hAnsi="Liberation Sans" w:eastAsia="Liberation Sans" w:cs="Liberation Sans"/>
+                <w:b/>
+                <w:bCs/>
+                <w:color w:val="000000"/>
+                <w:sz w:val="24"/>
+                <w:szCs w:val="24"/>
+                <w:lang w:val="undefined"/>
+              </w:rPr>
+            </w:r>
           </w:p>
         </w:tc>
         <w:tc>
@@ -7574,18 +8082,61 @@
               <w:pBdr/>
               <w:spacing w:after="0" w:before="0" w:line="240" w:lineRule="auto"/>
               <w:ind/>
-              <w:rPr/>
+              <w:rPr>
+                <w:rFonts w:ascii="Liberation Sans" w:hAnsi="Liberation Sans" w:eastAsia="Liberation Sans" w:cs="Liberation Sans"/>
+                <w:b/>
+                <w:bCs/>
+                <w:color w:val="000000"/>
+                <w:sz w:val="24"/>
+                <w:szCs w:val="24"/>
+                <w14:ligatures w14:val="none"/>
+              </w:rPr>
             </w:pPr>
             <w:r>
               <w:rPr>
                 <w:rFonts w:ascii="Liberation Sans" w:hAnsi="Liberation Sans" w:eastAsia="Liberation Sans" w:cs="Liberation Sans"/>
                 <w:b/>
+                <w:bCs/>
                 <w:color w:val="000000"/>
                 <w:sz w:val="24"/>
+                <w:szCs w:val="24"/>
+                <w:lang w:val="undefined" w:bidi="undefined"/>
               </w:rPr>
-              <w:t xml:space="preserve">SQLTools</w:t>
             </w:r>
-            <w:r/>
+            <w:r>
+              <w:rPr>
+                <w:rFonts w:ascii="Liberation Sans" w:hAnsi="Liberation Sans" w:eastAsia="Liberation Sans" w:cs="Liberation Sans"/>
+                <w:b/>
+                <w:bCs/>
+                <w:color w:val="000000"/>
+                <w:sz w:val="24"/>
+                <w:szCs w:val="24"/>
+                <w:lang w:val="undefined"/>
+              </w:rPr>
+              <w:t xml:space="preserve">Database Client</w:t>
+            </w:r>
+            <w:r>
+              <w:rPr>
+                <w:rFonts w:ascii="Liberation Sans" w:hAnsi="Liberation Sans" w:eastAsia="Liberation Sans" w:cs="Liberation Sans"/>
+                <w:b/>
+                <w:bCs/>
+                <w:color w:val="000000"/>
+                <w:sz w:val="24"/>
+                <w:szCs w:val="24"/>
+                <w:lang w:val="undefined" w:bidi="undefined"/>
+              </w:rPr>
+            </w:r>
+            <w:r>
+              <w:rPr>
+                <w:rFonts w:ascii="Liberation Sans" w:hAnsi="Liberation Sans" w:eastAsia="Liberation Sans" w:cs="Liberation Sans"/>
+                <w:b/>
+                <w:bCs/>
+                <w:color w:val="000000"/>
+                <w:sz w:val="24"/>
+                <w:szCs w:val="24"/>
+                <w:lang w:val="undefined"/>
+              </w:rPr>
+            </w:r>
           </w:p>
         </w:tc>
         <w:tc>
@@ -7615,17 +8166,51 @@
               </w:pBdr>
               <w:spacing w:after="0" w:before="0" w:line="276" w:lineRule="auto"/>
               <w:ind w:right="0" w:firstLine="0" w:left="0"/>
-              <w:rPr/>
+              <w:rPr>
+                <w:rFonts w:ascii="Liberation Sans" w:hAnsi="Liberation Sans" w:eastAsia="Liberation Sans" w:cs="Liberation Sans"/>
+                <w:color w:val="000000"/>
+                <w:sz w:val="24"/>
+                <w:szCs w:val="24"/>
+                <w14:ligatures w14:val="none"/>
+              </w:rPr>
             </w:pPr>
             <w:r>
               <w:rPr>
                 <w:rFonts w:ascii="Liberation Sans" w:hAnsi="Liberation Sans" w:eastAsia="Liberation Sans" w:cs="Liberation Sans"/>
                 <w:color w:val="000000"/>
                 <w:sz w:val="24"/>
+                <w:szCs w:val="24"/>
+                <w:lang w:val="undefined" w:bidi="undefined"/>
               </w:rPr>
-              <w:t xml:space="preserve">Cliente SQL multi-banco (Postgres/MySQL).</w:t>
             </w:r>
-            <w:r/>
+            <w:r>
+              <w:rPr>
+                <w:rFonts w:ascii="Liberation Sans" w:hAnsi="Liberation Sans" w:eastAsia="Liberation Sans" w:cs="Liberation Sans"/>
+                <w:color w:val="000000"/>
+                <w:sz w:val="24"/>
+                <w:szCs w:val="24"/>
+                <w:lang w:val="undefined"/>
+              </w:rPr>
+              <w:t xml:space="preserve">Gerenciador completo de MySQL, PostgreSQL, SQLite, etc.</w:t>
+            </w:r>
+            <w:r>
+              <w:rPr>
+                <w:rFonts w:ascii="Liberation Sans" w:hAnsi="Liberation Sans" w:eastAsia="Liberation Sans" w:cs="Liberation Sans"/>
+                <w:color w:val="000000"/>
+                <w:sz w:val="24"/>
+                <w:szCs w:val="24"/>
+                <w:lang w:val="undefined" w:bidi="undefined"/>
+              </w:rPr>
+            </w:r>
+            <w:r>
+              <w:rPr>
+                <w:rFonts w:ascii="Liberation Sans" w:hAnsi="Liberation Sans" w:eastAsia="Liberation Sans" w:cs="Liberation Sans"/>
+                <w:color w:val="000000"/>
+                <w:sz w:val="24"/>
+                <w:szCs w:val="24"/>
+                <w:lang w:val="undefined"/>
+              </w:rPr>
+            </w:r>
           </w:p>
         </w:tc>
         <w:tc>
@@ -7650,7 +8235,13 @@
               <w:pBdr/>
               <w:spacing w:after="0" w:before="0" w:line="240" w:lineRule="auto"/>
               <w:ind/>
-              <w:rPr/>
+              <w:rPr>
+                <w:rFonts w:ascii="Courier New" w:hAnsi="Courier New" w:eastAsia="Courier New" w:cs="Courier New"/>
+                <w:color w:val="000000"/>
+                <w:sz w:val="20"/>
+                <w:szCs w:val="20"/>
+                <w14:ligatures w14:val="none"/>
+              </w:rPr>
             </w:pPr>
             <w:r>
               <w:rPr>
@@ -7658,123 +8249,35 @@
                 <w:color w:val="000000"/>
                 <w:sz w:val="24"/>
               </w:rPr>
-              <w:t xml:space="preserve">mtxr.sqltools</w:t>
             </w:r>
-            <w:r/>
-          </w:p>
-        </w:tc>
-      </w:tr>
-      <w:tr>
-        <w:trPr/>
-        <w:tc>
-          <w:tcPr>
-            <w:tcBorders>
-              <w:top w:val="single" w:color="000000" w:sz="6" w:space="0"/>
-              <w:left w:val="single" w:color="000000" w:sz="6" w:space="0"/>
-              <w:bottom w:val="single" w:color="000000" w:sz="6" w:space="0"/>
-              <w:right w:val="single" w:color="000000" w:sz="6" w:space="0"/>
-            </w:tcBorders>
-            <w:tcMar>
-              <w:left w:w="15" w:type="dxa"/>
-              <w:top w:w="15" w:type="dxa"/>
-              <w:right w:w="15" w:type="dxa"/>
-              <w:bottom w:w="15" w:type="dxa"/>
-            </w:tcMar>
-            <w:tcW w:w="1098" w:type="dxa"/>
-            <w:vAlign w:val="center"/>
-          </w:tcPr>
-          <w:p>
-            <w:pPr>
-              <w:pBdr/>
-              <w:spacing w:after="0" w:before="0" w:line="240" w:lineRule="auto"/>
-              <w:ind/>
-              <w:rPr/>
-            </w:pPr>
             <w:r>
               <w:rPr>
-                <w:rFonts w:ascii="Liberation Sans" w:hAnsi="Liberation Sans" w:eastAsia="Liberation Sans" w:cs="Liberation Sans"/>
-                <w:b/>
+                <w:rFonts w:ascii="Courier New" w:hAnsi="Courier New" w:eastAsia="Courier New" w:cs="Courier New"/>
                 <w:color w:val="000000"/>
-                <w:sz w:val="24"/>
+                <w:sz w:val="20"/>
+                <w:szCs w:val="20"/>
+                <w:lang w:val="undefined"/>
               </w:rPr>
-              <w:t xml:space="preserve">YAML</w:t>
+              <w:t xml:space="preserve">cweijan.vscode-database-client2</w:t>
             </w:r>
-            <w:r/>
-          </w:p>
-        </w:tc>
-        <w:tc>
-          <w:tcPr>
-            <w:tcBorders>
-              <w:top w:val="single" w:color="000000" w:sz="6" w:space="0"/>
-              <w:left w:val="single" w:color="000000" w:sz="6" w:space="0"/>
-              <w:bottom w:val="single" w:color="000000" w:sz="6" w:space="0"/>
-              <w:right w:val="single" w:color="000000" w:sz="6" w:space="0"/>
-            </w:tcBorders>
-            <w:tcMar>
-              <w:left w:w="15" w:type="dxa"/>
-              <w:top w:w="15" w:type="dxa"/>
-              <w:right w:w="15" w:type="dxa"/>
-              <w:bottom w:w="15" w:type="dxa"/>
-            </w:tcMar>
-            <w:tcW w:w="4700" w:type="dxa"/>
-            <w:vAlign w:val="center"/>
-          </w:tcPr>
-          <w:p>
-            <w:pPr>
-              <w:pBdr>
-                <w:top w:val="none" w:color="000000" w:sz="4" w:space="0"/>
-                <w:left w:val="none" w:color="000000" w:sz="4" w:space="0"/>
-                <w:bottom w:val="none" w:color="000000" w:sz="4" w:space="0"/>
-                <w:right w:val="none" w:color="000000" w:sz="4" w:space="0"/>
-              </w:pBdr>
-              <w:spacing w:after="0" w:before="0" w:line="276" w:lineRule="auto"/>
-              <w:ind w:right="0" w:firstLine="0" w:left="0"/>
-              <w:rPr/>
-            </w:pPr>
             <w:r>
               <w:rPr>
-                <w:rFonts w:ascii="Liberation Sans" w:hAnsi="Liberation Sans" w:eastAsia="Liberation Sans" w:cs="Liberation Sans"/>
+                <w:rFonts w:ascii="Courier New" w:hAnsi="Courier New" w:eastAsia="Courier New" w:cs="Courier New"/>
                 <w:color w:val="000000"/>
-                <w:sz w:val="24"/>
+                <w:sz w:val="20"/>
+                <w:szCs w:val="20"/>
+                <w:lang w:val="undefined" w:bidi="undefined"/>
               </w:rPr>
-              <w:t xml:space="preserve">Validação e suporte a schemas YAML.</w:t>
             </w:r>
-            <w:r/>
-          </w:p>
-        </w:tc>
-        <w:tc>
-          <w:tcPr>
-            <w:tcBorders>
-              <w:top w:val="single" w:color="000000" w:sz="6" w:space="0"/>
-              <w:left w:val="single" w:color="000000" w:sz="6" w:space="0"/>
-              <w:bottom w:val="single" w:color="000000" w:sz="6" w:space="0"/>
-              <w:right w:val="single" w:color="000000" w:sz="6" w:space="0"/>
-            </w:tcBorders>
-            <w:tcMar>
-              <w:left w:w="15" w:type="dxa"/>
-              <w:top w:w="15" w:type="dxa"/>
-              <w:right w:w="15" w:type="dxa"/>
-              <w:bottom w:w="15" w:type="dxa"/>
-            </w:tcMar>
-            <w:tcW w:w="2094" w:type="dxa"/>
-            <w:vAlign w:val="center"/>
-          </w:tcPr>
-          <w:p>
-            <w:pPr>
-              <w:pBdr/>
-              <w:spacing w:after="0" w:before="0" w:line="240" w:lineRule="auto"/>
-              <w:ind/>
-              <w:rPr/>
-            </w:pPr>
             <w:r>
               <w:rPr>
-                <w:rFonts w:ascii="Liberation Sans" w:hAnsi="Liberation Sans" w:eastAsia="Liberation Sans" w:cs="Liberation Sans"/>
+                <w:rFonts w:ascii="Courier New" w:hAnsi="Courier New" w:eastAsia="Courier New" w:cs="Courier New"/>
                 <w:color w:val="000000"/>
-                <w:sz w:val="24"/>
+                <w:sz w:val="20"/>
+                <w:szCs w:val="20"/>
+                <w:lang w:val="undefined"/>
               </w:rPr>
-              <w:t xml:space="preserve">redhat.vscode-yaml</w:t>
             </w:r>
-            <w:r/>
           </w:p>
         </w:tc>
       </w:tr>
@@ -7880,236 +8383,6 @@
         </w:pBdr>
         <w:spacing/>
         <w:ind w:right="0" w:firstLine="0" w:left="0"/>
-        <w:rPr>
-          <w:rFonts w:ascii="Courier New" w:hAnsi="Courier New" w:eastAsia="Courier New" w:cs="Courier New"/>
-          <w:color w:val="000000"/>
-          <w:sz w:val="20"/>
-          <w:szCs w:val="20"/>
-          <w14:ligatures w14:val="none"/>
-        </w:rPr>
-      </w:pPr>
-      <w:r>
-        <w:rPr>
-          <w:rFonts w:ascii="Courier New" w:hAnsi="Courier New" w:eastAsia="Courier New" w:cs="Courier New"/>
-          <w:color w:val="000000"/>
-          <w:sz w:val="20"/>
-          <w:szCs w:val="20"/>
-        </w:rPr>
-        <w:t xml:space="preserve">   "sqltools.useNodeRuntime":true,</w:t>
-      </w:r>
-      <w:r>
-        <w:rPr>
-          <w:rFonts w:ascii="Courier New" w:hAnsi="Courier New" w:eastAsia="Courier New" w:cs="Courier New"/>
-          <w:color w:val="000000"/>
-          <w:sz w:val="20"/>
-          <w:szCs w:val="20"/>
-          <w14:ligatures w14:val="none"/>
-        </w:rPr>
-      </w:r>
-      <w:r>
-        <w:rPr>
-          <w:rFonts w:ascii="Courier New" w:hAnsi="Courier New" w:eastAsia="Courier New" w:cs="Courier New"/>
-          <w:color w:val="000000"/>
-          <w:sz w:val="20"/>
-          <w:szCs w:val="20"/>
-          <w14:ligatures w14:val="none"/>
-        </w:rPr>
-      </w:r>
-    </w:p>
-    <w:p>
-      <w:pPr>
-        <w:pBdr>
-          <w:top w:val="none" w:color="000000" w:sz="4" w:space="0"/>
-          <w:left w:val="none" w:color="000000" w:sz="4" w:space="0"/>
-          <w:bottom w:val="none" w:color="000000" w:sz="4" w:space="0"/>
-          <w:right w:val="none" w:color="000000" w:sz="4" w:space="0"/>
-        </w:pBdr>
-        <w:spacing/>
-        <w:ind w:right="0" w:firstLine="0" w:left="0"/>
-        <w:rPr>
-          <w:rFonts w:ascii="Courier New" w:hAnsi="Courier New" w:eastAsia="Courier New" w:cs="Courier New"/>
-          <w:color w:val="000000"/>
-          <w:sz w:val="20"/>
-          <w:szCs w:val="20"/>
-          <w14:ligatures w14:val="none"/>
-        </w:rPr>
-      </w:pPr>
-      <w:r>
-        <w:rPr>
-          <w:rFonts w:ascii="Courier New" w:hAnsi="Courier New" w:eastAsia="Courier New" w:cs="Courier New"/>
-          <w:color w:val="000000"/>
-          <w:sz w:val="20"/>
-          <w:szCs w:val="20"/>
-        </w:rPr>
-        <w:t xml:space="preserve">   "yaml.validate":true,</w:t>
-      </w:r>
-      <w:r>
-        <w:rPr>
-          <w:rFonts w:ascii="Courier New" w:hAnsi="Courier New" w:eastAsia="Courier New" w:cs="Courier New"/>
-          <w:color w:val="000000"/>
-          <w:sz w:val="20"/>
-          <w:szCs w:val="20"/>
-          <w14:ligatures w14:val="none"/>
-        </w:rPr>
-      </w:r>
-      <w:r>
-        <w:rPr>
-          <w:rFonts w:ascii="Courier New" w:hAnsi="Courier New" w:eastAsia="Courier New" w:cs="Courier New"/>
-          <w:color w:val="000000"/>
-          <w:sz w:val="20"/>
-          <w:szCs w:val="20"/>
-          <w14:ligatures w14:val="none"/>
-        </w:rPr>
-      </w:r>
-    </w:p>
-    <w:p>
-      <w:pPr>
-        <w:pBdr>
-          <w:top w:val="none" w:color="000000" w:sz="4" w:space="0"/>
-          <w:left w:val="none" w:color="000000" w:sz="4" w:space="0"/>
-          <w:bottom w:val="none" w:color="000000" w:sz="4" w:space="0"/>
-          <w:right w:val="none" w:color="000000" w:sz="4" w:space="0"/>
-        </w:pBdr>
-        <w:spacing/>
-        <w:ind w:right="0" w:firstLine="0" w:left="0"/>
-        <w:rPr>
-          <w:rFonts w:ascii="Courier New" w:hAnsi="Courier New" w:eastAsia="Courier New" w:cs="Courier New"/>
-          <w:color w:val="000000"/>
-          <w:sz w:val="20"/>
-          <w:szCs w:val="20"/>
-          <w14:ligatures w14:val="none"/>
-        </w:rPr>
-      </w:pPr>
-      <w:r>
-        <w:rPr>
-          <w:rFonts w:ascii="Courier New" w:hAnsi="Courier New" w:eastAsia="Courier New" w:cs="Courier New"/>
-          <w:color w:val="000000"/>
-          <w:sz w:val="20"/>
-          <w:szCs w:val="20"/>
-        </w:rPr>
-        <w:t xml:space="preserve">   "files.associations":{</w:t>
-      </w:r>
-      <w:r>
-        <w:rPr>
-          <w:rFonts w:ascii="Courier New" w:hAnsi="Courier New" w:eastAsia="Courier New" w:cs="Courier New"/>
-          <w:color w:val="000000"/>
-          <w:sz w:val="20"/>
-          <w:szCs w:val="20"/>
-          <w14:ligatures w14:val="none"/>
-        </w:rPr>
-      </w:r>
-      <w:r>
-        <w:rPr>
-          <w:rFonts w:ascii="Courier New" w:hAnsi="Courier New" w:eastAsia="Courier New" w:cs="Courier New"/>
-          <w:color w:val="000000"/>
-          <w:sz w:val="20"/>
-          <w:szCs w:val="20"/>
-          <w14:ligatures w14:val="none"/>
-        </w:rPr>
-      </w:r>
-    </w:p>
-    <w:p>
-      <w:pPr>
-        <w:pBdr>
-          <w:top w:val="none" w:color="000000" w:sz="4" w:space="0"/>
-          <w:left w:val="none" w:color="000000" w:sz="4" w:space="0"/>
-          <w:bottom w:val="none" w:color="000000" w:sz="4" w:space="0"/>
-          <w:right w:val="none" w:color="000000" w:sz="4" w:space="0"/>
-        </w:pBdr>
-        <w:spacing/>
-        <w:ind w:right="0" w:firstLine="0" w:left="0"/>
-        <w:rPr>
-          <w:rFonts w:ascii="Courier New" w:hAnsi="Courier New" w:eastAsia="Courier New" w:cs="Courier New"/>
-          <w:color w:val="000000"/>
-          <w:sz w:val="20"/>
-          <w:szCs w:val="20"/>
-          <w14:ligatures w14:val="none"/>
-        </w:rPr>
-      </w:pPr>
-      <w:r>
-        <w:rPr>
-          <w:rFonts w:ascii="Courier New" w:hAnsi="Courier New" w:eastAsia="Courier New" w:cs="Courier New"/>
-          <w:color w:val="000000"/>
-          <w:sz w:val="20"/>
-          <w:szCs w:val="20"/>
-        </w:rPr>
-        <w:t xml:space="preserve">      "*.yml":"yaml"</w:t>
-      </w:r>
-      <w:r>
-        <w:rPr>
-          <w:rFonts w:ascii="Courier New" w:hAnsi="Courier New" w:eastAsia="Courier New" w:cs="Courier New"/>
-          <w:color w:val="000000"/>
-          <w:sz w:val="20"/>
-          <w:szCs w:val="20"/>
-          <w14:ligatures w14:val="none"/>
-        </w:rPr>
-      </w:r>
-      <w:r>
-        <w:rPr>
-          <w:rFonts w:ascii="Courier New" w:hAnsi="Courier New" w:eastAsia="Courier New" w:cs="Courier New"/>
-          <w:color w:val="000000"/>
-          <w:sz w:val="20"/>
-          <w:szCs w:val="20"/>
-          <w14:ligatures w14:val="none"/>
-        </w:rPr>
-      </w:r>
-    </w:p>
-    <w:p>
-      <w:pPr>
-        <w:pBdr>
-          <w:top w:val="none" w:color="000000" w:sz="4" w:space="0"/>
-          <w:left w:val="none" w:color="000000" w:sz="4" w:space="0"/>
-          <w:bottom w:val="none" w:color="000000" w:sz="4" w:space="0"/>
-          <w:right w:val="none" w:color="000000" w:sz="4" w:space="0"/>
-        </w:pBdr>
-        <w:spacing/>
-        <w:ind w:right="0" w:firstLine="0" w:left="0"/>
-        <w:rPr>
-          <w:rFonts w:ascii="Courier New" w:hAnsi="Courier New" w:eastAsia="Courier New" w:cs="Courier New"/>
-          <w:color w:val="000000"/>
-          <w:sz w:val="20"/>
-          <w:szCs w:val="20"/>
-          <w14:ligatures w14:val="none"/>
-        </w:rPr>
-      </w:pPr>
-      <w:r>
-        <w:rPr>
-          <w:rFonts w:ascii="Courier New" w:hAnsi="Courier New" w:eastAsia="Courier New" w:cs="Courier New"/>
-          <w:color w:val="000000"/>
-          <w:sz w:val="20"/>
-          <w:szCs w:val="20"/>
-        </w:rPr>
-        <w:t xml:space="preserve">   }</w:t>
-      </w:r>
-      <w:r>
-        <w:rPr>
-          <w:rFonts w:ascii="Courier New" w:hAnsi="Courier New" w:eastAsia="Courier New" w:cs="Courier New"/>
-          <w:color w:val="000000"/>
-          <w:sz w:val="20"/>
-          <w:szCs w:val="20"/>
-          <w14:ligatures w14:val="none"/>
-        </w:rPr>
-      </w:r>
-      <w:r>
-        <w:rPr>
-          <w:rFonts w:ascii="Courier New" w:hAnsi="Courier New" w:eastAsia="Courier New" w:cs="Courier New"/>
-          <w:color w:val="000000"/>
-          <w:sz w:val="20"/>
-          <w:szCs w:val="20"/>
-          <w14:ligatures w14:val="none"/>
-        </w:rPr>
-      </w:r>
-    </w:p>
-    <w:p>
-      <w:pPr>
-        <w:pBdr>
-          <w:top w:val="none" w:color="000000" w:sz="4" w:space="0"/>
-          <w:left w:val="none" w:color="000000" w:sz="4" w:space="0"/>
-          <w:bottom w:val="none" w:color="000000" w:sz="4" w:space="0"/>
-          <w:right w:val="none" w:color="000000" w:sz="4" w:space="0"/>
-        </w:pBdr>
-        <w:spacing/>
-        <w:ind w:right="0" w:firstLine="0" w:left="0"/>
         <w:rPr/>
       </w:pPr>
       <w:r>
@@ -8144,7 +8417,6 @@
         <w:rPr/>
       </w:pPr>
       <w:r/>
-      <w:r/>
       <w:bookmarkStart w:id="0" w:name="_GoBack"/>
       <w:r/>
       <w:bookmarkEnd w:id="0"/>
@@ -8153,7 +8425,7 @@
     </w:p>
     <w:p>
       <w:pPr>
-        <w:pStyle w:val="857"/>
+        <w:pStyle w:val="859"/>
         <w:pBdr>
           <w:top w:val="none" w:color="000000" w:sz="4" w:space="0"/>
           <w:left w:val="none" w:color="000000" w:sz="4" w:space="0"/>
@@ -8217,7 +8489,7 @@
     </w:p>
     <w:p>
       <w:pPr>
-        <w:pStyle w:val="918"/>
+        <w:pStyle w:val="920"/>
         <w:numPr>
           <w:ilvl w:val="0"/>
           <w:numId w:val="15"/>
@@ -8261,7 +8533,7 @@
     </w:p>
     <w:p>
       <w:pPr>
-        <w:pStyle w:val="918"/>
+        <w:pStyle w:val="920"/>
         <w:numPr>
           <w:ilvl w:val="0"/>
           <w:numId w:val="15"/>
@@ -8322,7 +8594,7 @@
     </w:p>
     <w:p>
       <w:pPr>
-        <w:pStyle w:val="918"/>
+        <w:pStyle w:val="920"/>
         <w:numPr>
           <w:ilvl w:val="0"/>
           <w:numId w:val="15"/>
@@ -8366,7 +8638,7 @@
     </w:p>
     <w:p>
       <w:pPr>
-        <w:pStyle w:val="918"/>
+        <w:pStyle w:val="920"/>
         <w:numPr>
           <w:ilvl w:val="0"/>
           <w:numId w:val="15"/>
@@ -8410,7 +8682,7 @@
     </w:p>
     <w:p>
       <w:pPr>
-        <w:pStyle w:val="918"/>
+        <w:pStyle w:val="920"/>
         <w:numPr>
           <w:ilvl w:val="0"/>
           <w:numId w:val="15"/>
@@ -8488,7 +8760,7 @@
     </w:p>
     <w:p>
       <w:pPr>
-        <w:pStyle w:val="918"/>
+        <w:pStyle w:val="920"/>
         <w:numPr>
           <w:ilvl w:val="0"/>
           <w:numId w:val="15"/>
@@ -8568,7 +8840,6 @@
         <w:ind w:right="0" w:firstLine="0" w:left="0"/>
         <w:rPr/>
       </w:pPr>
-      <w:r/>
       <w:r/>
       <w:r/>
     </w:p>
@@ -10921,9 +11192,9 @@
     <w:lsdException w:name="Bibliography" w:uiPriority="37"/>
     <w:lsdException w:name="TOC Heading" w:uiPriority="39" w:qFormat="1"/>
   </w:latentStyles>
-  <w:style w:type="table" w:styleId="729">
+  <w:style w:type="table" w:styleId="731">
     <w:name w:val="Table Grid"/>
-    <w:basedOn w:val="915"/>
+    <w:basedOn w:val="917"/>
     <w:uiPriority w:val="59"/>
     <w:pPr>
       <w:pBdr/>
@@ -11120,9 +11391,9 @@
       </w:tcPr>
     </w:tblStylePr>
   </w:style>
-  <w:style w:type="table" w:styleId="730">
+  <w:style w:type="table" w:styleId="732">
     <w:name w:val="Table Grid Light"/>
-    <w:basedOn w:val="915"/>
+    <w:basedOn w:val="917"/>
     <w:uiPriority w:val="59"/>
     <w:pPr>
       <w:pBdr/>
@@ -11319,9 +11590,9 @@
       </w:tcPr>
     </w:tblStylePr>
   </w:style>
-  <w:style w:type="table" w:styleId="731">
+  <w:style w:type="table" w:styleId="733">
     <w:name w:val="Plain Table 1"/>
-    <w:basedOn w:val="915"/>
+    <w:basedOn w:val="917"/>
     <w:uiPriority w:val="59"/>
     <w:pPr>
       <w:pBdr/>
@@ -11544,9 +11815,9 @@
       </w:tcPr>
     </w:tblStylePr>
   </w:style>
-  <w:style w:type="table" w:styleId="732">
+  <w:style w:type="table" w:styleId="734">
     <w:name w:val="Plain Table 2"/>
-    <w:basedOn w:val="915"/>
+    <w:basedOn w:val="917"/>
     <w:uiPriority w:val="59"/>
     <w:pPr>
       <w:pBdr/>
@@ -11777,9 +12048,9 @@
       </w:tcPr>
     </w:tblStylePr>
   </w:style>
-  <w:style w:type="table" w:styleId="733">
+  <w:style w:type="table" w:styleId="735">
     <w:name w:val="Plain Table 3"/>
-    <w:basedOn w:val="915"/>
+    <w:basedOn w:val="917"/>
     <w:uiPriority w:val="99"/>
     <w:pPr>
       <w:pBdr/>
@@ -12007,9 +12278,9 @@
       </w:tcPr>
     </w:tblStylePr>
   </w:style>
-  <w:style w:type="table" w:styleId="734">
+  <w:style w:type="table" w:styleId="736">
     <w:name w:val="Plain Table 4"/>
-    <w:basedOn w:val="915"/>
+    <w:basedOn w:val="917"/>
     <w:uiPriority w:val="99"/>
     <w:pPr>
       <w:pBdr/>
@@ -12223,9 +12494,9 @@
       </w:tcPr>
     </w:tblStylePr>
   </w:style>
-  <w:style w:type="table" w:styleId="735">
+  <w:style w:type="table" w:styleId="737">
     <w:name w:val="Plain Table 5"/>
-    <w:basedOn w:val="915"/>
+    <w:basedOn w:val="917"/>
     <w:uiPriority w:val="99"/>
     <w:pPr>
       <w:pBdr/>
@@ -12456,9 +12727,9 @@
       </w:tcPr>
     </w:tblStylePr>
   </w:style>
-  <w:style w:type="table" w:styleId="736">
+  <w:style w:type="table" w:styleId="738">
     <w:name w:val="Grid Table 1 Light"/>
-    <w:basedOn w:val="915"/>
+    <w:basedOn w:val="917"/>
     <w:uiPriority w:val="99"/>
     <w:pPr>
       <w:pBdr/>
@@ -12679,9 +12950,9 @@
       </w:tcPr>
     </w:tblStylePr>
   </w:style>
-  <w:style w:type="table" w:styleId="737">
+  <w:style w:type="table" w:styleId="739">
     <w:name w:val="Grid Table 1 Light - Accent 1"/>
-    <w:basedOn w:val="915"/>
+    <w:basedOn w:val="917"/>
     <w:uiPriority w:val="99"/>
     <w:pPr>
       <w:pBdr/>
@@ -12902,9 +13173,9 @@
       </w:tcPr>
     </w:tblStylePr>
   </w:style>
-  <w:style w:type="table" w:styleId="738">
+  <w:style w:type="table" w:styleId="740">
     <w:name w:val="Grid Table 1 Light - Accent 2"/>
-    <w:basedOn w:val="915"/>
+    <w:basedOn w:val="917"/>
     <w:uiPriority w:val="99"/>
     <w:pPr>
       <w:pBdr/>
@@ -13125,9 +13396,9 @@
       </w:tcPr>
     </w:tblStylePr>
   </w:style>
-  <w:style w:type="table" w:styleId="739">
+  <w:style w:type="table" w:styleId="741">
     <w:name w:val="Grid Table 1 Light - Accent 3"/>
-    <w:basedOn w:val="915"/>
+    <w:basedOn w:val="917"/>
     <w:uiPriority w:val="99"/>
     <w:pPr>
       <w:pBdr/>
@@ -13348,9 +13619,9 @@
       </w:tcPr>
     </w:tblStylePr>
   </w:style>
-  <w:style w:type="table" w:styleId="740">
+  <w:style w:type="table" w:styleId="742">
     <w:name w:val="Grid Table 1 Light - Accent 4"/>
-    <w:basedOn w:val="915"/>
+    <w:basedOn w:val="917"/>
     <w:uiPriority w:val="99"/>
     <w:pPr>
       <w:pBdr/>
@@ -13571,9 +13842,9 @@
       </w:tcPr>
     </w:tblStylePr>
   </w:style>
-  <w:style w:type="table" w:styleId="741">
+  <w:style w:type="table" w:styleId="743">
     <w:name w:val="Grid Table 1 Light - Accent 5"/>
-    <w:basedOn w:val="915"/>
+    <w:basedOn w:val="917"/>
     <w:uiPriority w:val="99"/>
     <w:pPr>
       <w:pBdr/>
@@ -13794,9 +14065,9 @@
       </w:tcPr>
     </w:tblStylePr>
   </w:style>
-  <w:style w:type="table" w:styleId="742">
+  <w:style w:type="table" w:styleId="744">
     <w:name w:val="Grid Table 1 Light - Accent 6"/>
-    <w:basedOn w:val="915"/>
+    <w:basedOn w:val="917"/>
     <w:uiPriority w:val="99"/>
     <w:pPr>
       <w:pBdr/>
@@ -14017,9 +14288,9 @@
       </w:tcPr>
     </w:tblStylePr>
   </w:style>
-  <w:style w:type="table" w:styleId="743">
+  <w:style w:type="table" w:styleId="745">
     <w:name w:val="Grid Table 2"/>
-    <w:basedOn w:val="915"/>
+    <w:basedOn w:val="917"/>
     <w:uiPriority w:val="99"/>
     <w:pPr>
       <w:pBdr/>
@@ -14249,9 +14520,9 @@
       </w:tcPr>
     </w:tblStylePr>
   </w:style>
-  <w:style w:type="table" w:styleId="744">
+  <w:style w:type="table" w:styleId="746">
     <w:name w:val="Grid Table 2 - Accent 1"/>
-    <w:basedOn w:val="915"/>
+    <w:basedOn w:val="917"/>
     <w:uiPriority w:val="99"/>
     <w:pPr>
       <w:pBdr/>
@@ -14481,9 +14752,9 @@
       </w:tcPr>
     </w:tblStylePr>
   </w:style>
-  <w:style w:type="table" w:styleId="745">
+  <w:style w:type="table" w:styleId="747">
     <w:name w:val="Grid Table 2 - Accent 2"/>
-    <w:basedOn w:val="915"/>
+    <w:basedOn w:val="917"/>
     <w:uiPriority w:val="99"/>
     <w:pPr>
       <w:pBdr/>
@@ -14713,9 +14984,9 @@
       </w:tcPr>
     </w:tblStylePr>
   </w:style>
-  <w:style w:type="table" w:styleId="746">
+  <w:style w:type="table" w:styleId="748">
     <w:name w:val="Grid Table 2 - Accent 3"/>
-    <w:basedOn w:val="915"/>
+    <w:basedOn w:val="917"/>
     <w:uiPriority w:val="99"/>
     <w:pPr>
       <w:pBdr/>
@@ -14945,9 +15216,9 @@
       </w:tcPr>
     </w:tblStylePr>
   </w:style>
-  <w:style w:type="table" w:styleId="747">
+  <w:style w:type="table" w:styleId="749">
     <w:name w:val="Grid Table 2 - Accent 4"/>
-    <w:basedOn w:val="915"/>
+    <w:basedOn w:val="917"/>
     <w:uiPriority w:val="99"/>
     <w:pPr>
       <w:pBdr/>
@@ -15177,9 +15448,9 @@
       </w:tcPr>
     </w:tblStylePr>
   </w:style>
-  <w:style w:type="table" w:styleId="748">
+  <w:style w:type="table" w:styleId="750">
     <w:name w:val="Grid Table 2 - Accent 5"/>
-    <w:basedOn w:val="915"/>
+    <w:basedOn w:val="917"/>
     <w:uiPriority w:val="99"/>
     <w:pPr>
       <w:pBdr/>
@@ -15409,9 +15680,9 @@
       </w:tcPr>
     </w:tblStylePr>
   </w:style>
-  <w:style w:type="table" w:styleId="749">
+  <w:style w:type="table" w:styleId="751">
     <w:name w:val="Grid Table 2 - Accent 6"/>
-    <w:basedOn w:val="915"/>
+    <w:basedOn w:val="917"/>
     <w:uiPriority w:val="99"/>
     <w:pPr>
       <w:pBdr/>
@@ -15641,9 +15912,9 @@
       </w:tcPr>
     </w:tblStylePr>
   </w:style>
-  <w:style w:type="table" w:styleId="750">
+  <w:style w:type="table" w:styleId="752">
     <w:name w:val="Grid Table 3"/>
-    <w:basedOn w:val="915"/>
+    <w:basedOn w:val="917"/>
     <w:uiPriority w:val="99"/>
     <w:pPr>
       <w:pBdr/>
@@ -15886,9 +16157,9 @@
       </w:tcPr>
     </w:tblStylePr>
   </w:style>
-  <w:style w:type="table" w:styleId="751">
+  <w:style w:type="table" w:styleId="753">
     <w:name w:val="Grid Table 3 - Accent 1"/>
-    <w:basedOn w:val="915"/>
+    <w:basedOn w:val="917"/>
     <w:uiPriority w:val="99"/>
     <w:pPr>
       <w:pBdr/>
@@ -16131,9 +16402,9 @@
       </w:tcPr>
     </w:tblStylePr>
   </w:style>
-  <w:style w:type="table" w:styleId="752">
+  <w:style w:type="table" w:styleId="754">
     <w:name w:val="Grid Table 3 - Accent 2"/>
-    <w:basedOn w:val="915"/>
+    <w:basedOn w:val="917"/>
     <w:uiPriority w:val="99"/>
     <w:pPr>
       <w:pBdr/>
@@ -16376,9 +16647,9 @@
       </w:tcPr>
     </w:tblStylePr>
   </w:style>
-  <w:style w:type="table" w:styleId="753">
+  <w:style w:type="table" w:styleId="755">
     <w:name w:val="Grid Table 3 - Accent 3"/>
-    <w:basedOn w:val="915"/>
+    <w:basedOn w:val="917"/>
     <w:uiPriority w:val="99"/>
     <w:pPr>
       <w:pBdr/>
@@ -16621,9 +16892,9 @@
       </w:tcPr>
     </w:tblStylePr>
   </w:style>
-  <w:style w:type="table" w:styleId="754">
+  <w:style w:type="table" w:styleId="756">
     <w:name w:val="Grid Table 3 - Accent 4"/>
-    <w:basedOn w:val="915"/>
+    <w:basedOn w:val="917"/>
     <w:uiPriority w:val="99"/>
     <w:pPr>
       <w:pBdr/>
@@ -16866,9 +17137,9 @@
       </w:tcPr>
     </w:tblStylePr>
   </w:style>
-  <w:style w:type="table" w:styleId="755">
+  <w:style w:type="table" w:styleId="757">
     <w:name w:val="Grid Table 3 - Accent 5"/>
-    <w:basedOn w:val="915"/>
+    <w:basedOn w:val="917"/>
     <w:uiPriority w:val="99"/>
     <w:pPr>
       <w:pBdr/>
@@ -17111,9 +17382,9 @@
       </w:tcPr>
     </w:tblStylePr>
   </w:style>
-  <w:style w:type="table" w:styleId="756">
+  <w:style w:type="table" w:styleId="758">
     <w:name w:val="Grid Table 3 - Accent 6"/>
-    <w:basedOn w:val="915"/>
+    <w:basedOn w:val="917"/>
     <w:uiPriority w:val="99"/>
     <w:pPr>
       <w:pBdr/>
@@ -17356,9 +17627,9 @@
       </w:tcPr>
     </w:tblStylePr>
   </w:style>
-  <w:style w:type="table" w:styleId="757">
+  <w:style w:type="table" w:styleId="759">
     <w:name w:val="Grid Table 4"/>
-    <w:basedOn w:val="915"/>
+    <w:basedOn w:val="917"/>
     <w:uiPriority w:val="59"/>
     <w:pPr>
       <w:pBdr/>
@@ -17589,9 +17860,9 @@
       </w:tcPr>
     </w:tblStylePr>
   </w:style>
-  <w:style w:type="table" w:styleId="758">
+  <w:style w:type="table" w:styleId="760">
     <w:name w:val="Grid Table 4 - Accent 1"/>
-    <w:basedOn w:val="915"/>
+    <w:basedOn w:val="917"/>
     <w:uiPriority w:val="59"/>
     <w:pPr>
       <w:pBdr/>
@@ -17822,9 +18093,9 @@
       </w:tcPr>
     </w:tblStylePr>
   </w:style>
-  <w:style w:type="table" w:styleId="759">
+  <w:style w:type="table" w:styleId="761">
     <w:name w:val="Grid Table 4 - Accent 2"/>
-    <w:basedOn w:val="915"/>
+    <w:basedOn w:val="917"/>
     <w:uiPriority w:val="59"/>
     <w:pPr>
       <w:pBdr/>
@@ -18055,9 +18326,9 @@
       </w:tcPr>
     </w:tblStylePr>
   </w:style>
-  <w:style w:type="table" w:styleId="760">
+  <w:style w:type="table" w:styleId="762">
     <w:name w:val="Grid Table 4 - Accent 3"/>
-    <w:basedOn w:val="915"/>
+    <w:basedOn w:val="917"/>
     <w:uiPriority w:val="59"/>
     <w:pPr>
       <w:pBdr/>
@@ -18288,9 +18559,9 @@
       </w:tcPr>
     </w:tblStylePr>
   </w:style>
-  <w:style w:type="table" w:styleId="761">
+  <w:style w:type="table" w:styleId="763">
     <w:name w:val="Grid Table 4 - Accent 4"/>
-    <w:basedOn w:val="915"/>
+    <w:basedOn w:val="917"/>
     <w:uiPriority w:val="59"/>
     <w:pPr>
       <w:pBdr/>
@@ -18521,9 +18792,9 @@
       </w:tcPr>
     </w:tblStylePr>
   </w:style>
-  <w:style w:type="table" w:styleId="762">
+  <w:style w:type="table" w:styleId="764">
     <w:name w:val="Grid Table 4 - Accent 5"/>
-    <w:basedOn w:val="915"/>
+    <w:basedOn w:val="917"/>
     <w:uiPriority w:val="59"/>
     <w:pPr>
       <w:pBdr/>
@@ -18754,9 +19025,9 @@
       </w:tcPr>
     </w:tblStylePr>
   </w:style>
-  <w:style w:type="table" w:styleId="763">
+  <w:style w:type="table" w:styleId="765">
     <w:name w:val="Grid Table 4 - Accent 6"/>
-    <w:basedOn w:val="915"/>
+    <w:basedOn w:val="917"/>
     <w:uiPriority w:val="59"/>
     <w:pPr>
       <w:pBdr/>
@@ -18987,9 +19258,9 @@
       </w:tcPr>
     </w:tblStylePr>
   </w:style>
-  <w:style w:type="table" w:styleId="764">
+  <w:style w:type="table" w:styleId="766">
     <w:name w:val="Grid Table 5 Dark"/>
-    <w:basedOn w:val="915"/>
+    <w:basedOn w:val="917"/>
     <w:uiPriority w:val="99"/>
     <w:pPr>
       <w:pBdr/>
@@ -19215,9 +19486,9 @@
       </w:tcPr>
     </w:tblStylePr>
   </w:style>
-  <w:style w:type="table" w:styleId="765">
+  <w:style w:type="table" w:styleId="767">
     <w:name w:val="Grid Table 5 Dark- Accent 1"/>
-    <w:basedOn w:val="915"/>
+    <w:basedOn w:val="917"/>
     <w:uiPriority w:val="99"/>
     <w:pPr>
       <w:pBdr/>
@@ -19443,9 +19714,9 @@
       </w:tcPr>
     </w:tblStylePr>
   </w:style>
-  <w:style w:type="table" w:styleId="766">
+  <w:style w:type="table" w:styleId="768">
     <w:name w:val="Grid Table 5 Dark - Accent 2"/>
-    <w:basedOn w:val="915"/>
+    <w:basedOn w:val="917"/>
     <w:uiPriority w:val="99"/>
     <w:pPr>
       <w:pBdr/>
@@ -19671,9 +19942,9 @@
       </w:tcPr>
     </w:tblStylePr>
   </w:style>
-  <w:style w:type="table" w:styleId="767">
+  <w:style w:type="table" w:styleId="769">
     <w:name w:val="Grid Table 5 Dark - Accent 3"/>
-    <w:basedOn w:val="915"/>
+    <w:basedOn w:val="917"/>
     <w:uiPriority w:val="99"/>
     <w:pPr>
       <w:pBdr/>
@@ -19899,9 +20170,9 @@
       </w:tcPr>
     </w:tblStylePr>
   </w:style>
-  <w:style w:type="table" w:styleId="768">
+  <w:style w:type="table" w:styleId="770">
     <w:name w:val="Grid Table 5 Dark- Accent 4"/>
-    <w:basedOn w:val="915"/>
+    <w:basedOn w:val="917"/>
     <w:uiPriority w:val="99"/>
     <w:pPr>
       <w:pBdr/>
@@ -20127,9 +20398,9 @@
       </w:tcPr>
     </w:tblStylePr>
   </w:style>
-  <w:style w:type="table" w:styleId="769">
+  <w:style w:type="table" w:styleId="771">
     <w:name w:val="Grid Table 5 Dark - Accent 5"/>
-    <w:basedOn w:val="915"/>
+    <w:basedOn w:val="917"/>
     <w:uiPriority w:val="99"/>
     <w:pPr>
       <w:pBdr/>
@@ -20355,9 +20626,9 @@
       </w:tcPr>
     </w:tblStylePr>
   </w:style>
-  <w:style w:type="table" w:styleId="770">
+  <w:style w:type="table" w:styleId="772">
     <w:name w:val="Grid Table 5 Dark - Accent 6"/>
-    <w:basedOn w:val="915"/>
+    <w:basedOn w:val="917"/>
     <w:uiPriority w:val="99"/>
     <w:pPr>
       <w:pBdr/>
@@ -20583,9 +20854,9 @@
       </w:tcPr>
     </w:tblStylePr>
   </w:style>
-  <w:style w:type="table" w:styleId="771">
+  <w:style w:type="table" w:styleId="773">
     <w:name w:val="Grid Table 6 Colorful"/>
-    <w:basedOn w:val="915"/>
+    <w:basedOn w:val="917"/>
     <w:uiPriority w:val="99"/>
     <w:pPr>
       <w:pBdr/>
@@ -20813,9 +21084,9 @@
       </w:tcPr>
     </w:tblStylePr>
   </w:style>
-  <w:style w:type="table" w:styleId="772">
+  <w:style w:type="table" w:styleId="774">
     <w:name w:val="Grid Table 6 Colorful - Accent 1"/>
-    <w:basedOn w:val="915"/>
+    <w:basedOn w:val="917"/>
     <w:uiPriority w:val="99"/>
     <w:pPr>
       <w:pBdr/>
@@ -21043,9 +21314,9 @@
       </w:tcPr>
     </w:tblStylePr>
   </w:style>
-  <w:style w:type="table" w:styleId="773">
+  <w:style w:type="table" w:styleId="775">
     <w:name w:val="Grid Table 6 Colorful - Accent 2"/>
-    <w:basedOn w:val="915"/>
+    <w:basedOn w:val="917"/>
     <w:uiPriority w:val="99"/>
     <w:pPr>
       <w:pBdr/>
@@ -21273,9 +21544,9 @@
       </w:tcPr>
     </w:tblStylePr>
   </w:style>
-  <w:style w:type="table" w:styleId="774">
+  <w:style w:type="table" w:styleId="776">
     <w:name w:val="Grid Table 6 Colorful - Accent 3"/>
-    <w:basedOn w:val="915"/>
+    <w:basedOn w:val="917"/>
     <w:uiPriority w:val="99"/>
     <w:pPr>
       <w:pBdr/>
@@ -21503,9 +21774,9 @@
       </w:tcPr>
     </w:tblStylePr>
   </w:style>
-  <w:style w:type="table" w:styleId="775">
+  <w:style w:type="table" w:styleId="777">
     <w:name w:val="Grid Table 6 Colorful - Accent 4"/>
-    <w:basedOn w:val="915"/>
+    <w:basedOn w:val="917"/>
     <w:uiPriority w:val="99"/>
     <w:pPr>
       <w:pBdr/>
@@ -21733,9 +22004,9 @@
       </w:tcPr>
     </w:tblStylePr>
   </w:style>
-  <w:style w:type="table" w:styleId="776">
+  <w:style w:type="table" w:styleId="778">
     <w:name w:val="Grid Table 6 Colorful - Accent 5"/>
-    <w:basedOn w:val="915"/>
+    <w:basedOn w:val="917"/>
     <w:uiPriority w:val="99"/>
     <w:pPr>
       <w:pBdr/>
@@ -21963,9 +22234,9 @@
       </w:tcPr>
     </w:tblStylePr>
   </w:style>
-  <w:style w:type="table" w:styleId="777">
+  <w:style w:type="table" w:styleId="779">
     <w:name w:val="Grid Table 6 Colorful - Accent 6"/>
-    <w:basedOn w:val="915"/>
+    <w:basedOn w:val="917"/>
     <w:uiPriority w:val="99"/>
     <w:pPr>
       <w:pBdr/>
@@ -22193,9 +22464,9 @@
       </w:tcPr>
     </w:tblStylePr>
   </w:style>
-  <w:style w:type="table" w:styleId="778">
+  <w:style w:type="table" w:styleId="780">
     <w:name w:val="Grid Table 7 Colorful"/>
-    <w:basedOn w:val="915"/>
+    <w:basedOn w:val="917"/>
     <w:uiPriority w:val="99"/>
     <w:pPr>
       <w:pBdr/>
@@ -22447,9 +22718,9 @@
       </w:tcPr>
     </w:tblStylePr>
   </w:style>
-  <w:style w:type="table" w:styleId="779">
+  <w:style w:type="table" w:styleId="781">
     <w:name w:val="Grid Table 7 Colorful - Accent 1"/>
-    <w:basedOn w:val="915"/>
+    <w:basedOn w:val="917"/>
     <w:uiPriority w:val="99"/>
     <w:pPr>
       <w:pBdr/>
@@ -22701,9 +22972,9 @@
       </w:tcPr>
     </w:tblStylePr>
   </w:style>
-  <w:style w:type="table" w:styleId="780">
+  <w:style w:type="table" w:styleId="782">
     <w:name w:val="Grid Table 7 Colorful - Accent 2"/>
-    <w:basedOn w:val="915"/>
+    <w:basedOn w:val="917"/>
     <w:uiPriority w:val="99"/>
     <w:pPr>
       <w:pBdr/>
@@ -22955,9 +23226,9 @@
       </w:tcPr>
     </w:tblStylePr>
   </w:style>
-  <w:style w:type="table" w:styleId="781">
+  <w:style w:type="table" w:styleId="783">
     <w:name w:val="Grid Table 7 Colorful - Accent 3"/>
-    <w:basedOn w:val="915"/>
+    <w:basedOn w:val="917"/>
     <w:uiPriority w:val="99"/>
     <w:pPr>
       <w:pBdr/>
@@ -23209,9 +23480,9 @@
       </w:tcPr>
     </w:tblStylePr>
   </w:style>
-  <w:style w:type="table" w:styleId="782">
+  <w:style w:type="table" w:styleId="784">
     <w:name w:val="Grid Table 7 Colorful - Accent 4"/>
-    <w:basedOn w:val="915"/>
+    <w:basedOn w:val="917"/>
     <w:uiPriority w:val="99"/>
     <w:pPr>
       <w:pBdr/>
@@ -23463,9 +23734,9 @@
       </w:tcPr>
     </w:tblStylePr>
   </w:style>
-  <w:style w:type="table" w:styleId="783">
+  <w:style w:type="table" w:styleId="785">
     <w:name w:val="Grid Table 7 Colorful - Accent 5"/>
-    <w:basedOn w:val="915"/>
+    <w:basedOn w:val="917"/>
     <w:uiPriority w:val="99"/>
     <w:pPr>
       <w:pBdr/>
@@ -23717,9 +23988,9 @@
       </w:tcPr>
     </w:tblStylePr>
   </w:style>
-  <w:style w:type="table" w:styleId="784">
+  <w:style w:type="table" w:styleId="786">
     <w:name w:val="Grid Table 7 Colorful - Accent 6"/>
-    <w:basedOn w:val="915"/>
+    <w:basedOn w:val="917"/>
     <w:uiPriority w:val="99"/>
     <w:pPr>
       <w:pBdr/>
@@ -23971,9 +24242,9 @@
       </w:tcPr>
     </w:tblStylePr>
   </w:style>
-  <w:style w:type="table" w:styleId="785">
+  <w:style w:type="table" w:styleId="787">
     <w:name w:val="List Table 1 Light"/>
-    <w:basedOn w:val="915"/>
+    <w:basedOn w:val="917"/>
     <w:uiPriority w:val="99"/>
     <w:pPr>
       <w:pBdr/>
@@ -24187,9 +24458,9 @@
       </w:tcPr>
     </w:tblStylePr>
   </w:style>
-  <w:style w:type="table" w:styleId="786">
+  <w:style w:type="table" w:styleId="788">
     <w:name w:val="List Table 1 Light - Accent 1"/>
-    <w:basedOn w:val="915"/>
+    <w:basedOn w:val="917"/>
     <w:uiPriority w:val="99"/>
     <w:pPr>
       <w:pBdr/>
@@ -24403,9 +24674,9 @@
       </w:tcPr>
     </w:tblStylePr>
   </w:style>
-  <w:style w:type="table" w:styleId="787">
+  <w:style w:type="table" w:styleId="789">
     <w:name w:val="List Table 1 Light - Accent 2"/>
-    <w:basedOn w:val="915"/>
+    <w:basedOn w:val="917"/>
     <w:uiPriority w:val="99"/>
     <w:pPr>
       <w:pBdr/>
@@ -24619,9 +24890,9 @@
       </w:tcPr>
     </w:tblStylePr>
   </w:style>
-  <w:style w:type="table" w:styleId="788">
+  <w:style w:type="table" w:styleId="790">
     <w:name w:val="List Table 1 Light - Accent 3"/>
-    <w:basedOn w:val="915"/>
+    <w:basedOn w:val="917"/>
     <w:uiPriority w:val="99"/>
     <w:pPr>
       <w:pBdr/>
@@ -24835,9 +25106,9 @@
       </w:tcPr>
     </w:tblStylePr>
   </w:style>
-  <w:style w:type="table" w:styleId="789">
+  <w:style w:type="table" w:styleId="791">
     <w:name w:val="List Table 1 Light - Accent 4"/>
-    <w:basedOn w:val="915"/>
+    <w:basedOn w:val="917"/>
     <w:uiPriority w:val="99"/>
     <w:pPr>
       <w:pBdr/>
@@ -25051,9 +25322,9 @@
       </w:tcPr>
     </w:tblStylePr>
   </w:style>
-  <w:style w:type="table" w:styleId="790">
+  <w:style w:type="table" w:styleId="792">
     <w:name w:val="List Table 1 Light - Accent 5"/>
-    <w:basedOn w:val="915"/>
+    <w:basedOn w:val="917"/>
     <w:uiPriority w:val="99"/>
     <w:pPr>
       <w:pBdr/>
@@ -25267,9 +25538,9 @@
       </w:tcPr>
     </w:tblStylePr>
   </w:style>
-  <w:style w:type="table" w:styleId="791">
+  <w:style w:type="table" w:styleId="793">
     <w:name w:val="List Table 1 Light - Accent 6"/>
-    <w:basedOn w:val="915"/>
+    <w:basedOn w:val="917"/>
     <w:uiPriority w:val="99"/>
     <w:pPr>
       <w:pBdr/>
@@ -25483,9 +25754,9 @@
       </w:tcPr>
     </w:tblStylePr>
   </w:style>
-  <w:style w:type="table" w:styleId="792">
+  <w:style w:type="table" w:styleId="794">
     <w:name w:val="List Table 2"/>
-    <w:basedOn w:val="915"/>
+    <w:basedOn w:val="917"/>
     <w:uiPriority w:val="99"/>
     <w:pPr>
       <w:pBdr/>
@@ -25721,9 +25992,9 @@
       </w:tcPr>
     </w:tblStylePr>
   </w:style>
-  <w:style w:type="table" w:styleId="793">
+  <w:style w:type="table" w:styleId="795">
     <w:name w:val="List Table 2 - Accent 1"/>
-    <w:basedOn w:val="915"/>
+    <w:basedOn w:val="917"/>
     <w:uiPriority w:val="99"/>
     <w:pPr>
       <w:pBdr/>
@@ -25959,9 +26230,9 @@
       </w:tcPr>
     </w:tblStylePr>
   </w:style>
-  <w:style w:type="table" w:styleId="794">
+  <w:style w:type="table" w:styleId="796">
     <w:name w:val="List Table 2 - Accent 2"/>
-    <w:basedOn w:val="915"/>
+    <w:basedOn w:val="917"/>
     <w:uiPriority w:val="99"/>
     <w:pPr>
       <w:pBdr/>
@@ -26197,9 +26468,9 @@
       </w:tcPr>
     </w:tblStylePr>
   </w:style>
-  <w:style w:type="table" w:styleId="795">
+  <w:style w:type="table" w:styleId="797">
     <w:name w:val="List Table 2 - Accent 3"/>
-    <w:basedOn w:val="915"/>
+    <w:basedOn w:val="917"/>
     <w:uiPriority w:val="99"/>
     <w:pPr>
       <w:pBdr/>
@@ -26435,9 +26706,9 @@
       </w:tcPr>
     </w:tblStylePr>
   </w:style>
-  <w:style w:type="table" w:styleId="796">
+  <w:style w:type="table" w:styleId="798">
     <w:name w:val="List Table 2 - Accent 4"/>
-    <w:basedOn w:val="915"/>
+    <w:basedOn w:val="917"/>
     <w:uiPriority w:val="99"/>
     <w:pPr>
       <w:pBdr/>
@@ -26673,9 +26944,9 @@
       </w:tcPr>
     </w:tblStylePr>
   </w:style>
-  <w:style w:type="table" w:styleId="797">
+  <w:style w:type="table" w:styleId="799">
     <w:name w:val="List Table 2 - Accent 5"/>
-    <w:basedOn w:val="915"/>
+    <w:basedOn w:val="917"/>
     <w:uiPriority w:val="99"/>
     <w:pPr>
       <w:pBdr/>
@@ -26911,9 +27182,9 @@
       </w:tcPr>
     </w:tblStylePr>
   </w:style>
-  <w:style w:type="table" w:styleId="798">
+  <w:style w:type="table" w:styleId="800">
     <w:name w:val="List Table 2 - Accent 6"/>
-    <w:basedOn w:val="915"/>
+    <w:basedOn w:val="917"/>
     <w:uiPriority w:val="99"/>
     <w:pPr>
       <w:pBdr/>
@@ -27149,9 +27420,9 @@
       </w:tcPr>
     </w:tblStylePr>
   </w:style>
-  <w:style w:type="table" w:styleId="799">
+  <w:style w:type="table" w:styleId="801">
     <w:name w:val="List Table 3"/>
-    <w:basedOn w:val="915"/>
+    <w:basedOn w:val="917"/>
     <w:uiPriority w:val="99"/>
     <w:pPr>
       <w:pBdr/>
@@ -27377,9 +27648,9 @@
       </w:tcPr>
     </w:tblStylePr>
   </w:style>
-  <w:style w:type="table" w:styleId="800">
+  <w:style w:type="table" w:styleId="802">
     <w:name w:val="List Table 3 - Accent 1"/>
-    <w:basedOn w:val="915"/>
+    <w:basedOn w:val="917"/>
     <w:uiPriority w:val="99"/>
     <w:pPr>
       <w:pBdr/>
@@ -27605,9 +27876,9 @@
       </w:tcPr>
     </w:tblStylePr>
   </w:style>
-  <w:style w:type="table" w:styleId="801">
+  <w:style w:type="table" w:styleId="803">
     <w:name w:val="List Table 3 - Accent 2"/>
-    <w:basedOn w:val="915"/>
+    <w:basedOn w:val="917"/>
     <w:uiPriority w:val="99"/>
     <w:pPr>
       <w:pBdr/>
@@ -27833,9 +28104,9 @@
       </w:tcPr>
     </w:tblStylePr>
   </w:style>
-  <w:style w:type="table" w:styleId="802">
+  <w:style w:type="table" w:styleId="804">
     <w:name w:val="List Table 3 - Accent 3"/>
-    <w:basedOn w:val="915"/>
+    <w:basedOn w:val="917"/>
     <w:uiPriority w:val="99"/>
     <w:pPr>
       <w:pBdr/>
@@ -28061,9 +28332,9 @@
       </w:tcPr>
     </w:tblStylePr>
   </w:style>
-  <w:style w:type="table" w:styleId="803">
+  <w:style w:type="table" w:styleId="805">
     <w:name w:val="List Table 3 - Accent 4"/>
-    <w:basedOn w:val="915"/>
+    <w:basedOn w:val="917"/>
     <w:uiPriority w:val="99"/>
     <w:pPr>
       <w:pBdr/>
@@ -28289,9 +28560,9 @@
       </w:tcPr>
     </w:tblStylePr>
   </w:style>
-  <w:style w:type="table" w:styleId="804">
+  <w:style w:type="table" w:styleId="806">
     <w:name w:val="List Table 3 - Accent 5"/>
-    <w:basedOn w:val="915"/>
+    <w:basedOn w:val="917"/>
     <w:uiPriority w:val="99"/>
     <w:pPr>
       <w:pBdr/>
@@ -28517,9 +28788,9 @@
       </w:tcPr>
     </w:tblStylePr>
   </w:style>
-  <w:style w:type="table" w:styleId="805">
+  <w:style w:type="table" w:styleId="807">
     <w:name w:val="List Table 3 - Accent 6"/>
-    <w:basedOn w:val="915"/>
+    <w:basedOn w:val="917"/>
     <w:uiPriority w:val="99"/>
     <w:pPr>
       <w:pBdr/>
@@ -28745,9 +29016,9 @@
       </w:tcPr>
     </w:tblStylePr>
   </w:style>
-  <w:style w:type="table" w:styleId="806">
+  <w:style w:type="table" w:styleId="808">
     <w:name w:val="List Table 4"/>
-    <w:basedOn w:val="915"/>
+    <w:basedOn w:val="917"/>
     <w:uiPriority w:val="99"/>
     <w:pPr>
       <w:pBdr/>
@@ -28970,9 +29241,9 @@
       </w:tcPr>
     </w:tblStylePr>
   </w:style>
-  <w:style w:type="table" w:styleId="807">
+  <w:style w:type="table" w:styleId="809">
     <w:name w:val="List Table 4 - Accent 1"/>
-    <w:basedOn w:val="915"/>
+    <w:basedOn w:val="917"/>
     <w:uiPriority w:val="99"/>
     <w:pPr>
       <w:pBdr/>
@@ -29195,9 +29466,9 @@
       </w:tcPr>
     </w:tblStylePr>
   </w:style>
-  <w:style w:type="table" w:styleId="808">
+  <w:style w:type="table" w:styleId="810">
     <w:name w:val="List Table 4 - Accent 2"/>
-    <w:basedOn w:val="915"/>
+    <w:basedOn w:val="917"/>
     <w:uiPriority w:val="99"/>
     <w:pPr>
       <w:pBdr/>
@@ -29420,9 +29691,9 @@
       </w:tcPr>
     </w:tblStylePr>
   </w:style>
-  <w:style w:type="table" w:styleId="809">
+  <w:style w:type="table" w:styleId="811">
     <w:name w:val="List Table 4 - Accent 3"/>
-    <w:basedOn w:val="915"/>
+    <w:basedOn w:val="917"/>
     <w:uiPriority w:val="99"/>
     <w:pPr>
       <w:pBdr/>
@@ -29645,9 +29916,9 @@
       </w:tcPr>
     </w:tblStylePr>
   </w:style>
-  <w:style w:type="table" w:styleId="810">
+  <w:style w:type="table" w:styleId="812">
     <w:name w:val="List Table 4 - Accent 4"/>
-    <w:basedOn w:val="915"/>
+    <w:basedOn w:val="917"/>
     <w:uiPriority w:val="99"/>
     <w:pPr>
       <w:pBdr/>
@@ -29870,9 +30141,9 @@
       </w:tcPr>
     </w:tblStylePr>
   </w:style>
-  <w:style w:type="table" w:styleId="811">
+  <w:style w:type="table" w:styleId="813">
     <w:name w:val="List Table 4 - Accent 5"/>
-    <w:basedOn w:val="915"/>
+    <w:basedOn w:val="917"/>
     <w:uiPriority w:val="99"/>
     <w:pPr>
       <w:pBdr/>
@@ -30095,9 +30366,9 @@
       </w:tcPr>
     </w:tblStylePr>
   </w:style>
-  <w:style w:type="table" w:styleId="812">
+  <w:style w:type="table" w:styleId="814">
     <w:name w:val="List Table 4 - Accent 6"/>
-    <w:basedOn w:val="915"/>
+    <w:basedOn w:val="917"/>
     <w:uiPriority w:val="99"/>
     <w:pPr>
       <w:pBdr/>
@@ -30320,9 +30591,9 @@
       </w:tcPr>
     </w:tblStylePr>
   </w:style>
-  <w:style w:type="table" w:styleId="813">
+  <w:style w:type="table" w:styleId="815">
     <w:name w:val="List Table 5 Dark"/>
-    <w:basedOn w:val="915"/>
+    <w:basedOn w:val="917"/>
     <w:uiPriority w:val="99"/>
     <w:pPr>
       <w:pBdr/>
@@ -30562,9 +30833,9 @@
       </w:tcPr>
     </w:tblStylePr>
   </w:style>
-  <w:style w:type="table" w:styleId="814">
+  <w:style w:type="table" w:styleId="816">
     <w:name w:val="List Table 5 Dark - Accent 1"/>
-    <w:basedOn w:val="915"/>
+    <w:basedOn w:val="917"/>
     <w:uiPriority w:val="99"/>
     <w:pPr>
       <w:pBdr/>
@@ -30804,9 +31075,9 @@
       </w:tcPr>
     </w:tblStylePr>
   </w:style>
-  <w:style w:type="table" w:styleId="815">
+  <w:style w:type="table" w:styleId="817">
     <w:name w:val="List Table 5 Dark - Accent 2"/>
-    <w:basedOn w:val="915"/>
+    <w:basedOn w:val="917"/>
     <w:uiPriority w:val="99"/>
     <w:pPr>
       <w:pBdr/>
@@ -31046,9 +31317,9 @@
       </w:tcPr>
     </w:tblStylePr>
   </w:style>
-  <w:style w:type="table" w:styleId="816">
+  <w:style w:type="table" w:styleId="818">
     <w:name w:val="List Table 5 Dark - Accent 3"/>
-    <w:basedOn w:val="915"/>
+    <w:basedOn w:val="917"/>
     <w:uiPriority w:val="99"/>
     <w:pPr>
       <w:pBdr/>
@@ -31288,9 +31559,9 @@
       </w:tcPr>
     </w:tblStylePr>
   </w:style>
-  <w:style w:type="table" w:styleId="817">
+  <w:style w:type="table" w:styleId="819">
     <w:name w:val="List Table 5 Dark - Accent 4"/>
-    <w:basedOn w:val="915"/>
+    <w:basedOn w:val="917"/>
     <w:uiPriority w:val="99"/>
     <w:pPr>
       <w:pBdr/>
@@ -31530,9 +31801,9 @@
       </w:tcPr>
     </w:tblStylePr>
   </w:style>
-  <w:style w:type="table" w:styleId="818">
+  <w:style w:type="table" w:styleId="820">
     <w:name w:val="List Table 5 Dark - Accent 5"/>
-    <w:basedOn w:val="915"/>
+    <w:basedOn w:val="917"/>
     <w:uiPriority w:val="99"/>
     <w:pPr>
       <w:pBdr/>
@@ -31772,9 +32043,9 @@
       </w:tcPr>
     </w:tblStylePr>
   </w:style>
-  <w:style w:type="table" w:styleId="819">
+  <w:style w:type="table" w:styleId="821">
     <w:name w:val="List Table 5 Dark - Accent 6"/>
-    <w:basedOn w:val="915"/>
+    <w:basedOn w:val="917"/>
     <w:uiPriority w:val="99"/>
     <w:pPr>
       <w:pBdr/>
@@ -32014,9 +32285,9 @@
       </w:tcPr>
     </w:tblStylePr>
   </w:style>
-  <w:style w:type="table" w:styleId="820">
+  <w:style w:type="table" w:styleId="822">
     <w:name w:val="List Table 6 Colorful"/>
-    <w:basedOn w:val="915"/>
+    <w:basedOn w:val="917"/>
     <w:uiPriority w:val="99"/>
     <w:pPr>
       <w:pBdr/>
@@ -32237,9 +32508,9 @@
       </w:tcPr>
     </w:tblStylePr>
   </w:style>
-  <w:style w:type="table" w:styleId="821">
+  <w:style w:type="table" w:styleId="823">
     <w:name w:val="List Table 6 Colorful - Accent 1"/>
-    <w:basedOn w:val="915"/>
+    <w:basedOn w:val="917"/>
     <w:uiPriority w:val="99"/>
     <w:pPr>
       <w:pBdr/>
@@ -32460,9 +32731,9 @@
       </w:tcPr>
     </w:tblStylePr>
   </w:style>
-  <w:style w:type="table" w:styleId="822">
+  <w:style w:type="table" w:styleId="824">
     <w:name w:val="List Table 6 Colorful - Accent 2"/>
-    <w:basedOn w:val="915"/>
+    <w:basedOn w:val="917"/>
     <w:uiPriority w:val="99"/>
     <w:pPr>
       <w:pBdr/>
@@ -32683,9 +32954,9 @@
       </w:tcPr>
     </w:tblStylePr>
   </w:style>
-  <w:style w:type="table" w:styleId="823">
+  <w:style w:type="table" w:styleId="825">
     <w:name w:val="List Table 6 Colorful - Accent 3"/>
-    <w:basedOn w:val="915"/>
+    <w:basedOn w:val="917"/>
     <w:uiPriority w:val="99"/>
     <w:pPr>
       <w:pBdr/>
@@ -32906,9 +33177,9 @@
       </w:tcPr>
     </w:tblStylePr>
   </w:style>
-  <w:style w:type="table" w:styleId="824">
+  <w:style w:type="table" w:styleId="826">
     <w:name w:val="List Table 6 Colorful - Accent 4"/>
-    <w:basedOn w:val="915"/>
+    <w:basedOn w:val="917"/>
     <w:uiPriority w:val="99"/>
     <w:pPr>
       <w:pBdr/>
@@ -33129,9 +33400,9 @@
       </w:tcPr>
     </w:tblStylePr>
   </w:style>
-  <w:style w:type="table" w:styleId="825">
+  <w:style w:type="table" w:styleId="827">
     <w:name w:val="List Table 6 Colorful - Accent 5"/>
-    <w:basedOn w:val="915"/>
+    <w:basedOn w:val="917"/>
     <w:uiPriority w:val="99"/>
     <w:pPr>
       <w:pBdr/>
@@ -33352,9 +33623,9 @@
       </w:tcPr>
     </w:tblStylePr>
   </w:style>
-  <w:style w:type="table" w:styleId="826">
+  <w:style w:type="table" w:styleId="828">
     <w:name w:val="List Table 6 Colorful - Accent 6"/>
-    <w:basedOn w:val="915"/>
+    <w:basedOn w:val="917"/>
     <w:uiPriority w:val="99"/>
     <w:pPr>
       <w:pBdr/>
@@ -33575,9 +33846,9 @@
       </w:tcPr>
     </w:tblStylePr>
   </w:style>
-  <w:style w:type="table" w:styleId="827">
+  <w:style w:type="table" w:styleId="829">
     <w:name w:val="List Table 7 Colorful"/>
-    <w:basedOn w:val="915"/>
+    <w:basedOn w:val="917"/>
     <w:uiPriority w:val="99"/>
     <w:pPr>
       <w:pBdr/>
@@ -33831,9 +34102,9 @@
       </w:tcPr>
     </w:tblStylePr>
   </w:style>
-  <w:style w:type="table" w:styleId="828">
+  <w:style w:type="table" w:styleId="830">
     <w:name w:val="List Table 7 Colorful - Accent 1"/>
-    <w:basedOn w:val="915"/>
+    <w:basedOn w:val="917"/>
     <w:uiPriority w:val="99"/>
     <w:pPr>
       <w:pBdr/>
@@ -34087,9 +34358,9 @@
       </w:tcPr>
     </w:tblStylePr>
   </w:style>
-  <w:style w:type="table" w:styleId="829">
+  <w:style w:type="table" w:styleId="831">
     <w:name w:val="List Table 7 Colorful - Accent 2"/>
-    <w:basedOn w:val="915"/>
+    <w:basedOn w:val="917"/>
     <w:uiPriority w:val="99"/>
     <w:pPr>
       <w:pBdr/>
@@ -34343,9 +34614,9 @@
       </w:tcPr>
     </w:tblStylePr>
   </w:style>
-  <w:style w:type="table" w:styleId="830">
+  <w:style w:type="table" w:styleId="832">
     <w:name w:val="List Table 7 Colorful - Accent 3"/>
-    <w:basedOn w:val="915"/>
+    <w:basedOn w:val="917"/>
     <w:uiPriority w:val="99"/>
     <w:pPr>
       <w:pBdr/>
@@ -34599,9 +34870,9 @@
       </w:tcPr>
     </w:tblStylePr>
   </w:style>
-  <w:style w:type="table" w:styleId="831">
+  <w:style w:type="table" w:styleId="833">
     <w:name w:val="List Table 7 Colorful - Accent 4"/>
-    <w:basedOn w:val="915"/>
+    <w:basedOn w:val="917"/>
     <w:uiPriority w:val="99"/>
     <w:pPr>
       <w:pBdr/>
@@ -34855,9 +35126,9 @@
       </w:tcPr>
     </w:tblStylePr>
   </w:style>
-  <w:style w:type="table" w:styleId="832">
+  <w:style w:type="table" w:styleId="834">
     <w:name w:val="List Table 7 Colorful - Accent 5"/>
-    <w:basedOn w:val="915"/>
+    <w:basedOn w:val="917"/>
     <w:uiPriority w:val="99"/>
     <w:pPr>
       <w:pBdr/>
@@ -35111,9 +35382,9 @@
       </w:tcPr>
     </w:tblStylePr>
   </w:style>
-  <w:style w:type="table" w:styleId="833">
+  <w:style w:type="table" w:styleId="835">
     <w:name w:val="List Table 7 Colorful - Accent 6"/>
-    <w:basedOn w:val="915"/>
+    <w:basedOn w:val="917"/>
     <w:uiPriority w:val="99"/>
     <w:pPr>
       <w:pBdr/>
@@ -35367,9 +35638,9 @@
       </w:tcPr>
     </w:tblStylePr>
   </w:style>
-  <w:style w:type="table" w:styleId="834">
+  <w:style w:type="table" w:styleId="836">
     <w:name w:val="Lined - Accent"/>
-    <w:basedOn w:val="915"/>
+    <w:basedOn w:val="917"/>
     <w:uiPriority w:val="99"/>
     <w:pPr>
       <w:pBdr/>
@@ -35604,9 +35875,9 @@
       </w:tcPr>
     </w:tblStylePr>
   </w:style>
-  <w:style w:type="table" w:styleId="835">
+  <w:style w:type="table" w:styleId="837">
     <w:name w:val="Lined - Accent 1"/>
-    <w:basedOn w:val="915"/>
+    <w:basedOn w:val="917"/>
     <w:uiPriority w:val="99"/>
     <w:pPr>
       <w:pBdr/>
@@ -35841,9 +36112,9 @@
       </w:tcPr>
     </w:tblStylePr>
   </w:style>
-  <w:style w:type="table" w:styleId="836">
+  <w:style w:type="table" w:styleId="838">
     <w:name w:val="Lined - Accent 2"/>
-    <w:basedOn w:val="915"/>
+    <w:basedOn w:val="917"/>
     <w:uiPriority w:val="99"/>
     <w:pPr>
       <w:pBdr/>
@@ -36078,9 +36349,9 @@
       </w:tcPr>
     </w:tblStylePr>
   </w:style>
-  <w:style w:type="table" w:styleId="837">
+  <w:style w:type="table" w:styleId="839">
     <w:name w:val="Lined - Accent 3"/>
-    <w:basedOn w:val="915"/>
+    <w:basedOn w:val="917"/>
     <w:uiPriority w:val="99"/>
     <w:pPr>
       <w:pBdr/>
@@ -36315,9 +36586,9 @@
       </w:tcPr>
     </w:tblStylePr>
   </w:style>
-  <w:style w:type="table" w:styleId="838">
+  <w:style w:type="table" w:styleId="840">
     <w:name w:val="Lined - Accent 4"/>
-    <w:basedOn w:val="915"/>
+    <w:basedOn w:val="917"/>
     <w:uiPriority w:val="99"/>
     <w:pPr>
       <w:pBdr/>
@@ -36552,9 +36823,9 @@
       </w:tcPr>
     </w:tblStylePr>
   </w:style>
-  <w:style w:type="table" w:styleId="839">
+  <w:style w:type="table" w:styleId="841">
     <w:name w:val="Lined - Accent 5"/>
-    <w:basedOn w:val="915"/>
+    <w:basedOn w:val="917"/>
     <w:uiPriority w:val="99"/>
     <w:pPr>
       <w:pBdr/>
@@ -36789,9 +37060,9 @@
       </w:tcPr>
     </w:tblStylePr>
   </w:style>
-  <w:style w:type="table" w:styleId="840">
+  <w:style w:type="table" w:styleId="842">
     <w:name w:val="Lined - Accent 6"/>
-    <w:basedOn w:val="915"/>
+    <w:basedOn w:val="917"/>
     <w:uiPriority w:val="99"/>
     <w:pPr>
       <w:pBdr/>
@@ -37026,9 +37297,9 @@
       </w:tcPr>
     </w:tblStylePr>
   </w:style>
-  <w:style w:type="table" w:styleId="841">
+  <w:style w:type="table" w:styleId="843">
     <w:name w:val="Bordered &amp; Lined - Accent"/>
-    <w:basedOn w:val="915"/>
+    <w:basedOn w:val="917"/>
     <w:uiPriority w:val="99"/>
     <w:pPr>
       <w:pBdr/>
@@ -37270,9 +37541,9 @@
       </w:tcPr>
     </w:tblStylePr>
   </w:style>
-  <w:style w:type="table" w:styleId="842">
+  <w:style w:type="table" w:styleId="844">
     <w:name w:val="Bordered &amp; Lined - Accent 1"/>
-    <w:basedOn w:val="915"/>
+    <w:basedOn w:val="917"/>
     <w:uiPriority w:val="99"/>
     <w:pPr>
       <w:pBdr/>
@@ -37514,9 +37785,9 @@
       </w:tcPr>
     </w:tblStylePr>
   </w:style>
-  <w:style w:type="table" w:styleId="843">
+  <w:style w:type="table" w:styleId="845">
     <w:name w:val="Bordered &amp; Lined - Accent 2"/>
-    <w:basedOn w:val="915"/>
+    <w:basedOn w:val="917"/>
     <w:uiPriority w:val="99"/>
     <w:pPr>
       <w:pBdr/>
@@ -37758,9 +38029,9 @@
       </w:tcPr>
     </w:tblStylePr>
   </w:style>
-  <w:style w:type="table" w:styleId="844">
+  <w:style w:type="table" w:styleId="846">
     <w:name w:val="Bordered &amp; Lined - Accent 3"/>
-    <w:basedOn w:val="915"/>
+    <w:basedOn w:val="917"/>
     <w:uiPriority w:val="99"/>
     <w:pPr>
       <w:pBdr/>
@@ -38002,9 +38273,9 @@
       </w:tcPr>
     </w:tblStylePr>
   </w:style>
-  <w:style w:type="table" w:styleId="845">
+  <w:style w:type="table" w:styleId="847">
     <w:name w:val="Bordered &amp; Lined - Accent 4"/>
-    <w:basedOn w:val="915"/>
+    <w:basedOn w:val="917"/>
     <w:uiPriority w:val="99"/>
     <w:pPr>
       <w:pBdr/>
@@ -38246,9 +38517,9 @@
       </w:tcPr>
     </w:tblStylePr>
   </w:style>
-  <w:style w:type="table" w:styleId="846">
+  <w:style w:type="table" w:styleId="848">
     <w:name w:val="Bordered &amp; Lined - Accent 5"/>
-    <w:basedOn w:val="915"/>
+    <w:basedOn w:val="917"/>
     <w:uiPriority w:val="99"/>
     <w:pPr>
       <w:pBdr/>
@@ -38490,9 +38761,9 @@
       </w:tcPr>
     </w:tblStylePr>
   </w:style>
-  <w:style w:type="table" w:styleId="847">
+  <w:style w:type="table" w:styleId="849">
     <w:name w:val="Bordered &amp; Lined - Accent 6"/>
-    <w:basedOn w:val="915"/>
+    <w:basedOn w:val="917"/>
     <w:uiPriority w:val="99"/>
     <w:pPr>
       <w:pBdr/>
@@ -38734,9 +39005,9 @@
       </w:tcPr>
     </w:tblStylePr>
   </w:style>
-  <w:style w:type="table" w:styleId="848">
+  <w:style w:type="table" w:styleId="850">
     <w:name w:val="Bordered"/>
-    <w:basedOn w:val="915"/>
+    <w:basedOn w:val="917"/>
     <w:uiPriority w:val="99"/>
     <w:pPr>
       <w:pBdr/>
@@ -38965,9 +39236,9 @@
       </w:tcPr>
     </w:tblStylePr>
   </w:style>
-  <w:style w:type="table" w:styleId="849">
+  <w:style w:type="table" w:styleId="851">
     <w:name w:val="Bordered - Accent 1"/>
-    <w:basedOn w:val="915"/>
+    <w:basedOn w:val="917"/>
     <w:uiPriority w:val="99"/>
     <w:pPr>
       <w:pBdr/>
@@ -39196,9 +39467,9 @@
       </w:tcPr>
     </w:tblStylePr>
   </w:style>
-  <w:style w:type="table" w:styleId="850">
+  <w:style w:type="table" w:styleId="852">
     <w:name w:val="Bordered - Accent 2"/>
-    <w:basedOn w:val="915"/>
+    <w:basedOn w:val="917"/>
     <w:uiPriority w:val="99"/>
     <w:pPr>
       <w:pBdr/>
@@ -39427,9 +39698,9 @@
       </w:tcPr>
     </w:tblStylePr>
   </w:style>
-  <w:style w:type="table" w:styleId="851">
+  <w:style w:type="table" w:styleId="853">
     <w:name w:val="Bordered - Accent 3"/>
-    <w:basedOn w:val="915"/>
+    <w:basedOn w:val="917"/>
     <w:uiPriority w:val="99"/>
     <w:pPr>
       <w:pBdr/>
@@ -39658,9 +39929,9 @@
       </w:tcPr>
     </w:tblStylePr>
   </w:style>
-  <w:style w:type="table" w:styleId="852">
+  <w:style w:type="table" w:styleId="854">
     <w:name w:val="Bordered - Accent 4"/>
-    <w:basedOn w:val="915"/>
+    <w:basedOn w:val="917"/>
     <w:uiPriority w:val="99"/>
     <w:pPr>
       <w:pBdr/>
@@ -39889,9 +40160,9 @@
       </w:tcPr>
     </w:tblStylePr>
   </w:style>
-  <w:style w:type="table" w:styleId="853">
+  <w:style w:type="table" w:styleId="855">
     <w:name w:val="Bordered - Accent 5"/>
-    <w:basedOn w:val="915"/>
+    <w:basedOn w:val="917"/>
     <w:uiPriority w:val="99"/>
     <w:pPr>
       <w:pBdr/>
@@ -40120,9 +40391,9 @@
       </w:tcPr>
     </w:tblStylePr>
   </w:style>
-  <w:style w:type="table" w:styleId="854">
+  <w:style w:type="table" w:styleId="856">
     <w:name w:val="Bordered - Accent 6"/>
-    <w:basedOn w:val="915"/>
+    <w:basedOn w:val="917"/>
     <w:uiPriority w:val="99"/>
     <w:pPr>
       <w:pBdr/>
@@ -40351,11 +40622,11 @@
       </w:tcPr>
     </w:tblStylePr>
   </w:style>
-  <w:style w:type="paragraph" w:styleId="855">
+  <w:style w:type="paragraph" w:styleId="857">
     <w:name w:val="Heading 1"/>
-    <w:basedOn w:val="914"/>
-    <w:next w:val="914"/>
-    <w:link w:val="865"/>
+    <w:basedOn w:val="916"/>
+    <w:next w:val="916"/>
+    <w:link w:val="867"/>
     <w:uiPriority w:val="9"/>
     <w:qFormat/>
     <w:pPr>
@@ -40373,11 +40644,11 @@
       <w:szCs w:val="40"/>
     </w:rPr>
   </w:style>
-  <w:style w:type="paragraph" w:styleId="856">
+  <w:style w:type="paragraph" w:styleId="858">
     <w:name w:val="Heading 2"/>
-    <w:basedOn w:val="914"/>
-    <w:next w:val="914"/>
-    <w:link w:val="866"/>
+    <w:basedOn w:val="916"/>
+    <w:next w:val="916"/>
+    <w:link w:val="868"/>
     <w:uiPriority w:val="9"/>
     <w:unhideWhenUsed/>
     <w:qFormat/>
@@ -40396,11 +40667,11 @@
       <w:szCs w:val="32"/>
     </w:rPr>
   </w:style>
-  <w:style w:type="paragraph" w:styleId="857">
+  <w:style w:type="paragraph" w:styleId="859">
     <w:name w:val="Heading 3"/>
-    <w:basedOn w:val="914"/>
-    <w:next w:val="914"/>
-    <w:link w:val="867"/>
+    <w:basedOn w:val="916"/>
+    <w:next w:val="916"/>
+    <w:link w:val="869"/>
     <w:uiPriority w:val="9"/>
     <w:unhideWhenUsed/>
     <w:qFormat/>
@@ -40419,11 +40690,11 @@
       <w:szCs w:val="28"/>
     </w:rPr>
   </w:style>
-  <w:style w:type="paragraph" w:styleId="858">
+  <w:style w:type="paragraph" w:styleId="860">
     <w:name w:val="Heading 4"/>
-    <w:basedOn w:val="914"/>
-    <w:next w:val="914"/>
-    <w:link w:val="868"/>
+    <w:basedOn w:val="916"/>
+    <w:next w:val="916"/>
+    <w:link w:val="870"/>
     <w:uiPriority w:val="9"/>
     <w:unhideWhenUsed/>
     <w:qFormat/>
@@ -40442,11 +40713,11 @@
       <w:color w:val="0f4761" w:themeColor="accent1" w:themeShade="BF"/>
     </w:rPr>
   </w:style>
-  <w:style w:type="paragraph" w:styleId="859">
+  <w:style w:type="paragraph" w:styleId="861">
     <w:name w:val="Heading 5"/>
-    <w:basedOn w:val="914"/>
-    <w:next w:val="914"/>
-    <w:link w:val="869"/>
+    <w:basedOn w:val="916"/>
+    <w:next w:val="916"/>
+    <w:link w:val="871"/>
     <w:uiPriority w:val="9"/>
     <w:unhideWhenUsed/>
     <w:qFormat/>
@@ -40463,11 +40734,11 @@
       <w:color w:val="0f4761" w:themeColor="accent1" w:themeShade="BF"/>
     </w:rPr>
   </w:style>
-  <w:style w:type="paragraph" w:styleId="860">
+  <w:style w:type="paragraph" w:styleId="862">
     <w:name w:val="Heading 6"/>
-    <w:basedOn w:val="914"/>
-    <w:next w:val="914"/>
-    <w:link w:val="870"/>
+    <w:basedOn w:val="916"/>
+    <w:next w:val="916"/>
+    <w:link w:val="872"/>
     <w:uiPriority w:val="9"/>
     <w:unhideWhenUsed/>
     <w:qFormat/>
@@ -40486,11 +40757,11 @@
       <w:color w:val="595959" w:themeColor="text1" w:themeTint="A6"/>
     </w:rPr>
   </w:style>
-  <w:style w:type="paragraph" w:styleId="861">
+  <w:style w:type="paragraph" w:styleId="863">
     <w:name w:val="Heading 7"/>
-    <w:basedOn w:val="914"/>
-    <w:next w:val="914"/>
-    <w:link w:val="871"/>
+    <w:basedOn w:val="916"/>
+    <w:next w:val="916"/>
+    <w:link w:val="873"/>
     <w:uiPriority w:val="9"/>
     <w:unhideWhenUsed/>
     <w:qFormat/>
@@ -40507,11 +40778,11 @@
       <w:color w:val="595959" w:themeColor="text1" w:themeTint="A6"/>
     </w:rPr>
   </w:style>
-  <w:style w:type="paragraph" w:styleId="862">
+  <w:style w:type="paragraph" w:styleId="864">
     <w:name w:val="Heading 8"/>
-    <w:basedOn w:val="914"/>
-    <w:next w:val="914"/>
-    <w:link w:val="872"/>
+    <w:basedOn w:val="916"/>
+    <w:next w:val="916"/>
+    <w:link w:val="874"/>
     <w:uiPriority w:val="9"/>
     <w:unhideWhenUsed/>
     <w:qFormat/>
@@ -40530,11 +40801,11 @@
       <w:color w:val="272727" w:themeColor="text1" w:themeTint="D8"/>
     </w:rPr>
   </w:style>
-  <w:style w:type="paragraph" w:styleId="863">
+  <w:style w:type="paragraph" w:styleId="865">
     <w:name w:val="Heading 9"/>
-    <w:basedOn w:val="914"/>
-    <w:next w:val="914"/>
-    <w:link w:val="873"/>
+    <w:basedOn w:val="916"/>
+    <w:next w:val="916"/>
+    <w:link w:val="875"/>
     <w:uiPriority w:val="9"/>
     <w:unhideWhenUsed/>
     <w:qFormat/>
@@ -40553,7 +40824,7 @@
       <w:color w:val="272727" w:themeColor="text1" w:themeTint="D8"/>
     </w:rPr>
   </w:style>
-  <w:style w:type="character" w:styleId="864" w:default="1">
+  <w:style w:type="character" w:styleId="866" w:default="1">
     <w:name w:val="Default Paragraph Font"/>
     <w:uiPriority w:val="1"/>
     <w:semiHidden/>
@@ -40564,10 +40835,10 @@
       <w:ind/>
     </w:pPr>
   </w:style>
-  <w:style w:type="character" w:styleId="865">
+  <w:style w:type="character" w:styleId="867">
     <w:name w:val="Heading 1 Char"/>
-    <w:basedOn w:val="864"/>
-    <w:link w:val="855"/>
+    <w:basedOn w:val="866"/>
+    <w:link w:val="857"/>
     <w:uiPriority w:val="9"/>
     <w:pPr>
       <w:pBdr/>
@@ -40581,10 +40852,10 @@
       <w:szCs w:val="40"/>
     </w:rPr>
   </w:style>
-  <w:style w:type="character" w:styleId="866">
+  <w:style w:type="character" w:styleId="868">
     <w:name w:val="Heading 2 Char"/>
-    <w:basedOn w:val="864"/>
-    <w:link w:val="856"/>
+    <w:basedOn w:val="866"/>
+    <w:link w:val="858"/>
     <w:uiPriority w:val="9"/>
     <w:pPr>
       <w:pBdr/>
@@ -40598,10 +40869,10 @@
       <w:szCs w:val="32"/>
     </w:rPr>
   </w:style>
-  <w:style w:type="character" w:styleId="867">
+  <w:style w:type="character" w:styleId="869">
     <w:name w:val="Heading 3 Char"/>
-    <w:basedOn w:val="864"/>
-    <w:link w:val="857"/>
+    <w:basedOn w:val="866"/>
+    <w:link w:val="859"/>
     <w:uiPriority w:val="9"/>
     <w:pPr>
       <w:pBdr/>
@@ -40615,10 +40886,10 @@
       <w:szCs w:val="28"/>
     </w:rPr>
   </w:style>
-  <w:style w:type="character" w:styleId="868">
+  <w:style w:type="character" w:styleId="870">
     <w:name w:val="Heading 4 Char"/>
-    <w:basedOn w:val="864"/>
-    <w:link w:val="858"/>
+    <w:basedOn w:val="866"/>
+    <w:link w:val="860"/>
     <w:uiPriority w:val="9"/>
     <w:pPr>
       <w:pBdr/>
@@ -40632,10 +40903,10 @@
       <w:color w:val="0f4761" w:themeColor="accent1" w:themeShade="BF"/>
     </w:rPr>
   </w:style>
-  <w:style w:type="character" w:styleId="869">
+  <w:style w:type="character" w:styleId="871">
     <w:name w:val="Heading 5 Char"/>
-    <w:basedOn w:val="864"/>
-    <w:link w:val="859"/>
+    <w:basedOn w:val="866"/>
+    <w:link w:val="861"/>
     <w:uiPriority w:val="9"/>
     <w:pPr>
       <w:pBdr/>
@@ -40647,10 +40918,10 @@
       <w:color w:val="0f4761" w:themeColor="accent1" w:themeShade="BF"/>
     </w:rPr>
   </w:style>
-  <w:style w:type="character" w:styleId="870">
+  <w:style w:type="character" w:styleId="872">
     <w:name w:val="Heading 6 Char"/>
-    <w:basedOn w:val="864"/>
-    <w:link w:val="860"/>
+    <w:basedOn w:val="866"/>
+    <w:link w:val="862"/>
     <w:uiPriority w:val="9"/>
     <w:pPr>
       <w:pBdr/>
@@ -40664,10 +40935,10 @@
       <w:color w:val="595959" w:themeColor="text1" w:themeTint="A6"/>
     </w:rPr>
   </w:style>
-  <w:style w:type="character" w:styleId="871">
+  <w:style w:type="character" w:styleId="873">
     <w:name w:val="Heading 7 Char"/>
-    <w:basedOn w:val="864"/>
-    <w:link w:val="861"/>
+    <w:basedOn w:val="866"/>
+    <w:link w:val="863"/>
     <w:uiPriority w:val="9"/>
     <w:pPr>
       <w:pBdr/>
@@ -40679,10 +40950,10 @@
       <w:color w:val="595959" w:themeColor="text1" w:themeTint="A6"/>
     </w:rPr>
   </w:style>
-  <w:style w:type="character" w:styleId="872">
+  <w:style w:type="character" w:styleId="874">
     <w:name w:val="Heading 8 Char"/>
-    <w:basedOn w:val="864"/>
-    <w:link w:val="862"/>
+    <w:basedOn w:val="866"/>
+    <w:link w:val="864"/>
     <w:uiPriority w:val="9"/>
     <w:pPr>
       <w:pBdr/>
@@ -40696,10 +40967,10 @@
       <w:color w:val="272727" w:themeColor="text1" w:themeTint="D8"/>
     </w:rPr>
   </w:style>
-  <w:style w:type="character" w:styleId="873">
+  <w:style w:type="character" w:styleId="875">
     <w:name w:val="Heading 9 Char"/>
-    <w:basedOn w:val="864"/>
-    <w:link w:val="863"/>
+    <w:basedOn w:val="866"/>
+    <w:link w:val="865"/>
     <w:uiPriority w:val="9"/>
     <w:pPr>
       <w:pBdr/>
@@ -40713,11 +40984,11 @@
       <w:color w:val="272727" w:themeColor="text1" w:themeTint="D8"/>
     </w:rPr>
   </w:style>
-  <w:style w:type="paragraph" w:styleId="874">
+  <w:style w:type="paragraph" w:styleId="876">
     <w:name w:val="Title"/>
-    <w:basedOn w:val="914"/>
-    <w:next w:val="914"/>
-    <w:link w:val="875"/>
+    <w:basedOn w:val="916"/>
+    <w:next w:val="916"/>
+    <w:link w:val="877"/>
     <w:uiPriority w:val="10"/>
     <w:qFormat/>
     <w:pPr>
@@ -40733,10 +41004,10 @@
       <w:szCs w:val="56"/>
     </w:rPr>
   </w:style>
-  <w:style w:type="character" w:styleId="875">
+  <w:style w:type="character" w:styleId="877">
     <w:name w:val="Title Char"/>
-    <w:basedOn w:val="864"/>
-    <w:link w:val="874"/>
+    <w:basedOn w:val="866"/>
+    <w:link w:val="876"/>
     <w:uiPriority w:val="10"/>
     <w:pPr>
       <w:pBdr/>
@@ -40750,11 +41021,11 @@
       <w:szCs w:val="56"/>
     </w:rPr>
   </w:style>
-  <w:style w:type="paragraph" w:styleId="876">
+  <w:style w:type="paragraph" w:styleId="878">
     <w:name w:val="Subtitle"/>
-    <w:basedOn w:val="914"/>
-    <w:next w:val="914"/>
-    <w:link w:val="877"/>
+    <w:basedOn w:val="916"/>
+    <w:next w:val="916"/>
+    <w:link w:val="879"/>
     <w:uiPriority w:val="11"/>
     <w:qFormat/>
     <w:pPr>
@@ -40772,10 +41043,10 @@
       <w:szCs w:val="28"/>
     </w:rPr>
   </w:style>
-  <w:style w:type="character" w:styleId="877">
+  <w:style w:type="character" w:styleId="879">
     <w:name w:val="Subtitle Char"/>
-    <w:basedOn w:val="864"/>
-    <w:link w:val="876"/>
+    <w:basedOn w:val="866"/>
+    <w:link w:val="878"/>
     <w:uiPriority w:val="11"/>
     <w:pPr>
       <w:pBdr/>
@@ -40789,11 +41060,11 @@
       <w:szCs w:val="28"/>
     </w:rPr>
   </w:style>
-  <w:style w:type="paragraph" w:styleId="878">
+  <w:style w:type="paragraph" w:styleId="880">
     <w:name w:val="Quote"/>
-    <w:basedOn w:val="914"/>
-    <w:next w:val="914"/>
-    <w:link w:val="879"/>
+    <w:basedOn w:val="916"/>
+    <w:next w:val="916"/>
+    <w:link w:val="881"/>
     <w:uiPriority w:val="29"/>
     <w:qFormat/>
     <w:pPr>
@@ -40808,10 +41079,10 @@
       <w:color w:val="404040" w:themeColor="text1" w:themeTint="BF"/>
     </w:rPr>
   </w:style>
-  <w:style w:type="character" w:styleId="879">
+  <w:style w:type="character" w:styleId="881">
     <w:name w:val="Quote Char"/>
-    <w:basedOn w:val="864"/>
-    <w:link w:val="878"/>
+    <w:basedOn w:val="866"/>
+    <w:link w:val="880"/>
     <w:uiPriority w:val="29"/>
     <w:pPr>
       <w:pBdr/>
@@ -40824,9 +41095,9 @@
       <w:color w:val="404040" w:themeColor="text1" w:themeTint="BF"/>
     </w:rPr>
   </w:style>
-  <w:style w:type="character" w:styleId="880">
+  <w:style w:type="character" w:styleId="882">
     <w:name w:val="Intense Emphasis"/>
-    <w:basedOn w:val="864"/>
+    <w:basedOn w:val="866"/>
     <w:uiPriority w:val="21"/>
     <w:qFormat/>
     <w:pPr>
@@ -40840,11 +41111,11 @@
       <w:color w:val="0f4761" w:themeColor="accent1" w:themeShade="BF"/>
     </w:rPr>
   </w:style>
-  <w:style w:type="paragraph" w:styleId="881">
+  <w:style w:type="paragraph" w:styleId="883">
     <w:name w:val="Intense Quote"/>
-    <w:basedOn w:val="914"/>
-    <w:next w:val="914"/>
-    <w:link w:val="882"/>
+    <w:basedOn w:val="916"/>
+    <w:next w:val="916"/>
+    <w:link w:val="884"/>
     <w:uiPriority w:val="30"/>
     <w:qFormat/>
     <w:pPr>
@@ -40862,10 +41133,10 @@
       <w:color w:val="0f4761" w:themeColor="accent1" w:themeShade="BF"/>
     </w:rPr>
   </w:style>
-  <w:style w:type="character" w:styleId="882">
+  <w:style w:type="character" w:styleId="884">
     <w:name w:val="Intense Quote Char"/>
-    <w:basedOn w:val="864"/>
-    <w:link w:val="881"/>
+    <w:basedOn w:val="866"/>
+    <w:link w:val="883"/>
     <w:uiPriority w:val="30"/>
     <w:pPr>
       <w:pBdr/>
@@ -40878,9 +41149,9 @@
       <w:color w:val="0f4761" w:themeColor="accent1" w:themeShade="BF"/>
     </w:rPr>
   </w:style>
-  <w:style w:type="character" w:styleId="883">
+  <w:style w:type="character" w:styleId="885">
     <w:name w:val="Intense Reference"/>
-    <w:basedOn w:val="864"/>
+    <w:basedOn w:val="866"/>
     <w:uiPriority w:val="32"/>
     <w:qFormat/>
     <w:pPr>
@@ -40896,9 +41167,9 @@
       <w:spacing w:val="5"/>
     </w:rPr>
   </w:style>
-  <w:style w:type="character" w:styleId="884">
+  <w:style w:type="character" w:styleId="886">
     <w:name w:val="Subtle Emphasis"/>
-    <w:basedOn w:val="864"/>
+    <w:basedOn w:val="866"/>
     <w:uiPriority w:val="19"/>
     <w:qFormat/>
     <w:pPr>
@@ -40912,9 +41183,9 @@
       <w:color w:val="404040" w:themeColor="text1" w:themeTint="BF"/>
     </w:rPr>
   </w:style>
-  <w:style w:type="character" w:styleId="885">
+  <w:style w:type="character" w:styleId="887">
     <w:name w:val="Emphasis"/>
-    <w:basedOn w:val="864"/>
+    <w:basedOn w:val="866"/>
     <w:uiPriority w:val="20"/>
     <w:qFormat/>
     <w:pPr>
@@ -40927,9 +41198,9 @@
       <w:iCs/>
     </w:rPr>
   </w:style>
-  <w:style w:type="character" w:styleId="886">
+  <w:style w:type="character" w:styleId="888">
     <w:name w:val="Strong"/>
-    <w:basedOn w:val="864"/>
+    <w:basedOn w:val="866"/>
     <w:uiPriority w:val="22"/>
     <w:qFormat/>
     <w:pPr>
@@ -40942,9 +41213,9 @@
       <w:bCs/>
     </w:rPr>
   </w:style>
-  <w:style w:type="character" w:styleId="887">
+  <w:style w:type="character" w:styleId="889">
     <w:name w:val="Subtle Reference"/>
-    <w:basedOn w:val="864"/>
+    <w:basedOn w:val="866"/>
     <w:uiPriority w:val="31"/>
     <w:qFormat/>
     <w:pPr>
@@ -40957,9 +41228,9 @@
       <w:color w:val="5a5a5a" w:themeColor="text1" w:themeTint="A5"/>
     </w:rPr>
   </w:style>
-  <w:style w:type="character" w:styleId="888">
+  <w:style w:type="character" w:styleId="890">
     <w:name w:val="Book Title"/>
-    <w:basedOn w:val="864"/>
+    <w:basedOn w:val="866"/>
     <w:uiPriority w:val="33"/>
     <w:qFormat/>
     <w:pPr>
@@ -40975,36 +41246,9 @@
       <w:spacing w:val="5"/>
     </w:rPr>
   </w:style>
-  <w:style w:type="paragraph" w:styleId="889">
+  <w:style w:type="paragraph" w:styleId="891">
     <w:name w:val="Header"/>
-    <w:basedOn w:val="914"/>
-    <w:link w:val="890"/>
-    <w:uiPriority w:val="99"/>
-    <w:unhideWhenUsed/>
-    <w:pPr>
-      <w:pBdr/>
-      <w:tabs>
-        <w:tab w:val="center" w:leader="none" w:pos="4844"/>
-        <w:tab w:val="right" w:leader="none" w:pos="9689"/>
-      </w:tabs>
-      <w:spacing w:after="0" w:line="240" w:lineRule="auto"/>
-      <w:ind/>
-    </w:pPr>
-  </w:style>
-  <w:style w:type="character" w:styleId="890">
-    <w:name w:val="Header Char"/>
-    <w:basedOn w:val="864"/>
-    <w:link w:val="889"/>
-    <w:uiPriority w:val="99"/>
-    <w:pPr>
-      <w:pBdr/>
-      <w:spacing/>
-      <w:ind/>
-    </w:pPr>
-  </w:style>
-  <w:style w:type="paragraph" w:styleId="891">
-    <w:name w:val="Footer"/>
-    <w:basedOn w:val="914"/>
+    <w:basedOn w:val="916"/>
     <w:link w:val="892"/>
     <w:uiPriority w:val="99"/>
     <w:unhideWhenUsed/>
@@ -41019,8 +41263,8 @@
     </w:pPr>
   </w:style>
   <w:style w:type="character" w:styleId="892">
-    <w:name w:val="Footer Char"/>
-    <w:basedOn w:val="864"/>
+    <w:name w:val="Header Char"/>
+    <w:basedOn w:val="866"/>
     <w:link w:val="891"/>
     <w:uiPriority w:val="99"/>
     <w:pPr>
@@ -41030,9 +41274,36 @@
     </w:pPr>
   </w:style>
   <w:style w:type="paragraph" w:styleId="893">
+    <w:name w:val="Footer"/>
+    <w:basedOn w:val="916"/>
+    <w:link w:val="894"/>
+    <w:uiPriority w:val="99"/>
+    <w:unhideWhenUsed/>
+    <w:pPr>
+      <w:pBdr/>
+      <w:tabs>
+        <w:tab w:val="center" w:leader="none" w:pos="4844"/>
+        <w:tab w:val="right" w:leader="none" w:pos="9689"/>
+      </w:tabs>
+      <w:spacing w:after="0" w:line="240" w:lineRule="auto"/>
+      <w:ind/>
+    </w:pPr>
+  </w:style>
+  <w:style w:type="character" w:styleId="894">
+    <w:name w:val="Footer Char"/>
+    <w:basedOn w:val="866"/>
+    <w:link w:val="893"/>
+    <w:uiPriority w:val="99"/>
+    <w:pPr>
+      <w:pBdr/>
+      <w:spacing/>
+      <w:ind/>
+    </w:pPr>
+  </w:style>
+  <w:style w:type="paragraph" w:styleId="895">
     <w:name w:val="Caption"/>
-    <w:basedOn w:val="914"/>
-    <w:next w:val="914"/>
+    <w:basedOn w:val="916"/>
+    <w:next w:val="916"/>
     <w:uiPriority w:val="35"/>
     <w:unhideWhenUsed/>
     <w:qFormat/>
@@ -41049,10 +41320,10 @@
       <w:szCs w:val="18"/>
     </w:rPr>
   </w:style>
-  <w:style w:type="paragraph" w:styleId="894">
+  <w:style w:type="paragraph" w:styleId="896">
     <w:name w:val="footnote text"/>
-    <w:basedOn w:val="914"/>
-    <w:link w:val="895"/>
+    <w:basedOn w:val="916"/>
+    <w:link w:val="897"/>
     <w:uiPriority w:val="99"/>
     <w:semiHidden/>
     <w:unhideWhenUsed/>
@@ -41066,10 +41337,10 @@
       <w:szCs w:val="20"/>
     </w:rPr>
   </w:style>
-  <w:style w:type="character" w:styleId="895">
+  <w:style w:type="character" w:styleId="897">
     <w:name w:val="Footnote Text Char"/>
-    <w:basedOn w:val="864"/>
-    <w:link w:val="894"/>
+    <w:basedOn w:val="866"/>
+    <w:link w:val="896"/>
     <w:uiPriority w:val="99"/>
     <w:semiHidden/>
     <w:pPr>
@@ -41082,9 +41353,9 @@
       <w:szCs w:val="20"/>
     </w:rPr>
   </w:style>
-  <w:style w:type="character" w:styleId="896">
+  <w:style w:type="character" w:styleId="898">
     <w:name w:val="footnote reference"/>
-    <w:basedOn w:val="864"/>
+    <w:basedOn w:val="866"/>
     <w:uiPriority w:val="99"/>
     <w:semiHidden/>
     <w:unhideWhenUsed/>
@@ -41097,10 +41368,10 @@
       <w:vertAlign w:val="superscript"/>
     </w:rPr>
   </w:style>
-  <w:style w:type="paragraph" w:styleId="897">
+  <w:style w:type="paragraph" w:styleId="899">
     <w:name w:val="endnote text"/>
-    <w:basedOn w:val="914"/>
-    <w:link w:val="898"/>
+    <w:basedOn w:val="916"/>
+    <w:link w:val="900"/>
     <w:uiPriority w:val="99"/>
     <w:semiHidden/>
     <w:unhideWhenUsed/>
@@ -41114,10 +41385,10 @@
       <w:szCs w:val="20"/>
     </w:rPr>
   </w:style>
-  <w:style w:type="character" w:styleId="898">
+  <w:style w:type="character" w:styleId="900">
     <w:name w:val="Endnote Text Char"/>
-    <w:basedOn w:val="864"/>
-    <w:link w:val="897"/>
+    <w:basedOn w:val="866"/>
+    <w:link w:val="899"/>
     <w:uiPriority w:val="99"/>
     <w:semiHidden/>
     <w:pPr>
@@ -41130,9 +41401,9 @@
       <w:szCs w:val="20"/>
     </w:rPr>
   </w:style>
-  <w:style w:type="character" w:styleId="899">
+  <w:style w:type="character" w:styleId="901">
     <w:name w:val="endnote reference"/>
-    <w:basedOn w:val="864"/>
+    <w:basedOn w:val="866"/>
     <w:uiPriority w:val="99"/>
     <w:semiHidden/>
     <w:unhideWhenUsed/>
@@ -41145,9 +41416,9 @@
       <w:vertAlign w:val="superscript"/>
     </w:rPr>
   </w:style>
-  <w:style w:type="character" w:styleId="900">
+  <w:style w:type="character" w:styleId="902">
     <w:name w:val="Hyperlink"/>
-    <w:basedOn w:val="864"/>
+    <w:basedOn w:val="866"/>
     <w:uiPriority w:val="99"/>
     <w:unhideWhenUsed/>
     <w:pPr>
@@ -41160,9 +41431,9 @@
       <w:u w:val="single"/>
     </w:rPr>
   </w:style>
-  <w:style w:type="character" w:styleId="901">
+  <w:style w:type="character" w:styleId="903">
     <w:name w:val="FollowedHyperlink"/>
-    <w:basedOn w:val="864"/>
+    <w:basedOn w:val="866"/>
     <w:uiPriority w:val="99"/>
     <w:semiHidden/>
     <w:unhideWhenUsed/>
@@ -41176,10 +41447,10 @@
       <w:u w:val="single"/>
     </w:rPr>
   </w:style>
-  <w:style w:type="paragraph" w:styleId="902">
+  <w:style w:type="paragraph" w:styleId="904">
     <w:name w:val="toc 1"/>
-    <w:basedOn w:val="914"/>
-    <w:next w:val="914"/>
+    <w:basedOn w:val="916"/>
+    <w:next w:val="916"/>
     <w:uiPriority w:val="39"/>
     <w:unhideWhenUsed/>
     <w:pPr>
@@ -41188,10 +41459,10 @@
       <w:ind/>
     </w:pPr>
   </w:style>
-  <w:style w:type="paragraph" w:styleId="903">
+  <w:style w:type="paragraph" w:styleId="905">
     <w:name w:val="toc 2"/>
-    <w:basedOn w:val="914"/>
-    <w:next w:val="914"/>
+    <w:basedOn w:val="916"/>
+    <w:next w:val="916"/>
     <w:uiPriority w:val="39"/>
     <w:unhideWhenUsed/>
     <w:pPr>
@@ -41200,10 +41471,10 @@
       <w:ind w:left="220"/>
     </w:pPr>
   </w:style>
-  <w:style w:type="paragraph" w:styleId="904">
+  <w:style w:type="paragraph" w:styleId="906">
     <w:name w:val="toc 3"/>
-    <w:basedOn w:val="914"/>
-    <w:next w:val="914"/>
+    <w:basedOn w:val="916"/>
+    <w:next w:val="916"/>
     <w:uiPriority w:val="39"/>
     <w:unhideWhenUsed/>
     <w:pPr>
@@ -41212,10 +41483,10 @@
       <w:ind w:left="440"/>
     </w:pPr>
   </w:style>
-  <w:style w:type="paragraph" w:styleId="905">
+  <w:style w:type="paragraph" w:styleId="907">
     <w:name w:val="toc 4"/>
-    <w:basedOn w:val="914"/>
-    <w:next w:val="914"/>
+    <w:basedOn w:val="916"/>
+    <w:next w:val="916"/>
     <w:uiPriority w:val="39"/>
     <w:unhideWhenUsed/>
     <w:pPr>
@@ -41224,10 +41495,10 @@
       <w:ind w:left="660"/>
     </w:pPr>
   </w:style>
-  <w:style w:type="paragraph" w:styleId="906">
+  <w:style w:type="paragraph" w:styleId="908">
     <w:name w:val="toc 5"/>
-    <w:basedOn w:val="914"/>
-    <w:next w:val="914"/>
+    <w:basedOn w:val="916"/>
+    <w:next w:val="916"/>
     <w:uiPriority w:val="39"/>
     <w:unhideWhenUsed/>
     <w:pPr>
@@ -41236,10 +41507,10 @@
       <w:ind w:left="880"/>
     </w:pPr>
   </w:style>
-  <w:style w:type="paragraph" w:styleId="907">
+  <w:style w:type="paragraph" w:styleId="909">
     <w:name w:val="toc 6"/>
-    <w:basedOn w:val="914"/>
-    <w:next w:val="914"/>
+    <w:basedOn w:val="916"/>
+    <w:next w:val="916"/>
     <w:uiPriority w:val="39"/>
     <w:unhideWhenUsed/>
     <w:pPr>
@@ -41248,10 +41519,10 @@
       <w:ind w:left="1100"/>
     </w:pPr>
   </w:style>
-  <w:style w:type="paragraph" w:styleId="908">
+  <w:style w:type="paragraph" w:styleId="910">
     <w:name w:val="toc 7"/>
-    <w:basedOn w:val="914"/>
-    <w:next w:val="914"/>
+    <w:basedOn w:val="916"/>
+    <w:next w:val="916"/>
     <w:uiPriority w:val="39"/>
     <w:unhideWhenUsed/>
     <w:pPr>
@@ -41260,10 +41531,10 @@
       <w:ind w:left="1320"/>
     </w:pPr>
   </w:style>
-  <w:style w:type="paragraph" w:styleId="909">
+  <w:style w:type="paragraph" w:styleId="911">
     <w:name w:val="toc 8"/>
-    <w:basedOn w:val="914"/>
-    <w:next w:val="914"/>
+    <w:basedOn w:val="916"/>
+    <w:next w:val="916"/>
     <w:uiPriority w:val="39"/>
     <w:unhideWhenUsed/>
     <w:pPr>
@@ -41272,10 +41543,10 @@
       <w:ind w:left="1540"/>
     </w:pPr>
   </w:style>
-  <w:style w:type="paragraph" w:styleId="910">
+  <w:style w:type="paragraph" w:styleId="912">
     <w:name w:val="toc 9"/>
-    <w:basedOn w:val="914"/>
-    <w:next w:val="914"/>
+    <w:basedOn w:val="916"/>
+    <w:next w:val="916"/>
     <w:uiPriority w:val="39"/>
     <w:unhideWhenUsed/>
     <w:pPr>
@@ -41284,9 +41555,9 @@
       <w:ind w:left="1760"/>
     </w:pPr>
   </w:style>
-  <w:style w:type="character" w:styleId="911">
+  <w:style w:type="character" w:styleId="913">
     <w:name w:val="Placeholder Text"/>
-    <w:basedOn w:val="864"/>
+    <w:basedOn w:val="866"/>
     <w:uiPriority w:val="99"/>
     <w:semiHidden/>
     <w:pPr>
@@ -41298,7 +41569,7 @@
       <w:color w:val="666666"/>
     </w:rPr>
   </w:style>
-  <w:style w:type="paragraph" w:styleId="912">
+  <w:style w:type="paragraph" w:styleId="914">
     <w:name w:val="TOC Heading"/>
     <w:uiPriority w:val="39"/>
     <w:unhideWhenUsed/>
@@ -41308,10 +41579,10 @@
       <w:ind/>
     </w:pPr>
   </w:style>
-  <w:style w:type="paragraph" w:styleId="913">
+  <w:style w:type="paragraph" w:styleId="915">
     <w:name w:val="table of figures"/>
-    <w:basedOn w:val="914"/>
-    <w:next w:val="914"/>
+    <w:basedOn w:val="916"/>
+    <w:next w:val="916"/>
     <w:uiPriority w:val="99"/>
     <w:unhideWhenUsed/>
     <w:pPr>
@@ -41320,7 +41591,7 @@
       <w:ind/>
     </w:pPr>
   </w:style>
-  <w:style w:type="paragraph" w:styleId="914" w:default="1">
+  <w:style w:type="paragraph" w:styleId="916" w:default="1">
     <w:name w:val="Normal"/>
     <w:qFormat/>
     <w:pPr>
@@ -41329,7 +41600,7 @@
       <w:ind/>
     </w:pPr>
   </w:style>
-  <w:style w:type="table" w:styleId="915" w:default="1">
+  <w:style w:type="table" w:styleId="917" w:default="1">
     <w:name w:val="Normal Table"/>
     <w:uiPriority w:val="99"/>
     <w:semiHidden/>
@@ -41522,7 +41793,7 @@
       </w:tcPr>
     </w:tblStylePr>
   </w:style>
-  <w:style w:type="numbering" w:styleId="916" w:default="1">
+  <w:style w:type="numbering" w:styleId="918" w:default="1">
     <w:name w:val="No List"/>
     <w:uiPriority w:val="99"/>
     <w:semiHidden/>
@@ -41533,9 +41804,9 @@
       <w:ind/>
     </w:pPr>
   </w:style>
-  <w:style w:type="paragraph" w:styleId="917">
+  <w:style w:type="paragraph" w:styleId="919">
     <w:name w:val="No Spacing"/>
-    <w:basedOn w:val="914"/>
+    <w:basedOn w:val="916"/>
     <w:uiPriority w:val="1"/>
     <w:qFormat/>
     <w:pPr>
@@ -41544,9 +41815,9 @@
       <w:ind/>
     </w:pPr>
   </w:style>
-  <w:style w:type="paragraph" w:styleId="918">
+  <w:style w:type="paragraph" w:styleId="920">
     <w:name w:val="List Paragraph"/>
-    <w:basedOn w:val="914"/>
+    <w:basedOn w:val="916"/>
     <w:uiPriority w:val="34"/>
     <w:qFormat/>
     <w:pPr>

</xml_diff>